<commit_message>
sorry for late update
</commit_message>
<xml_diff>
--- a/IF11C/bgp/resources/5._Störungsfälle_unter_SLA_bearbeiten/LS5_Störungsfälle_unter_Beachtung_von_SLA_bearbeiten_S.docx
+++ b/IF11C/bgp/resources/5._Störungsfälle_unter_SLA_bearbeiten/LS5_Störungsfälle_unter_Beachtung_von_SLA_bearbeiten_S.docx
@@ -1,14 +1,14 @@
 
 <file path=word/document.xml><?xml version="1.0" encoding="utf-8"?>
-<w:document xmlns:wpc="http://schemas.microsoft.com/office/word/2010/wordprocessingCanvas" xmlns:cx="http://schemas.microsoft.com/office/drawing/2014/chartex" xmlns:cx1="http://schemas.microsoft.com/office/drawing/2015/9/8/chartex" xmlns:cx2="http://schemas.microsoft.com/office/drawing/2015/10/21/chartex" xmlns:cx3="http://schemas.microsoft.com/office/drawing/2016/5/9/chartex" xmlns:cx4="http://schemas.microsoft.com/office/drawing/2016/5/10/chartex" xmlns:cx5="http://schemas.microsoft.com/office/drawing/2016/5/11/chartex" xmlns:cx6="http://schemas.microsoft.com/office/drawing/2016/5/12/chartex" xmlns:cx7="http://schemas.microsoft.com/office/drawing/2016/5/13/chartex" xmlns:cx8="http://schemas.microsoft.com/office/drawing/2016/5/14/chartex" xmlns:mc="http://schemas.openxmlformats.org/markup-compatibility/2006" xmlns:aink="http://schemas.microsoft.com/office/drawing/2016/ink" xmlns:am3d="http://schemas.microsoft.com/office/drawing/2017/model3d" xmlns:o="urn:schemas-microsoft-com:office:office" xmlns:r="http://schemas.openxmlformats.org/officeDocument/2006/relationships" xmlns:m="http://schemas.openxmlformats.org/officeDocument/2006/math" xmlns:v="urn:schemas-microsoft-com:vml" xmlns:wp14="http://schemas.microsoft.com/office/word/2010/wordprocessingDrawing" xmlns:wp="http://schemas.openxmlformats.org/drawingml/2006/wordprocessingDrawing" xmlns:w10="urn:schemas-microsoft-com:office:word" xmlns:w="http://schemas.openxmlformats.org/wordprocessingml/2006/main" xmlns:w14="http://schemas.microsoft.com/office/word/2010/wordml" xmlns:w15="http://schemas.microsoft.com/office/word/2012/wordml" xmlns:w16cid="http://schemas.microsoft.com/office/word/2016/wordml/cid" xmlns:w16se="http://schemas.microsoft.com/office/word/2015/wordml/symex" xmlns:wpg="http://schemas.microsoft.com/office/word/2010/wordprocessingGroup" xmlns:wpi="http://schemas.microsoft.com/office/word/2010/wordprocessingInk" xmlns:wne="http://schemas.microsoft.com/office/word/2006/wordml" xmlns:wps="http://schemas.microsoft.com/office/word/2010/wordprocessingShape" xmlns:a="http://schemas.openxmlformats.org/drawingml/2006/main" xmlns:pic="http://schemas.openxmlformats.org/drawingml/2006/picture" xmlns:a14="http://schemas.microsoft.com/office/drawing/2010/main" xmlns:asvg="http://schemas.microsoft.com/office/drawing/2016/SVG/main" xmlns:dgm="http://schemas.openxmlformats.org/drawingml/2006/diagram" mc:Ignorable="w14 w15 w16se w16cid wp14">
+<w:document xmlns:wpc="http://schemas.microsoft.com/office/word/2010/wordprocessingCanvas" xmlns:cx="http://schemas.microsoft.com/office/drawing/2014/chartex" xmlns:cx1="http://schemas.microsoft.com/office/drawing/2015/9/8/chartex" xmlns:cx2="http://schemas.microsoft.com/office/drawing/2015/10/21/chartex" xmlns:cx3="http://schemas.microsoft.com/office/drawing/2016/5/9/chartex" xmlns:cx4="http://schemas.microsoft.com/office/drawing/2016/5/10/chartex" xmlns:cx5="http://schemas.microsoft.com/office/drawing/2016/5/11/chartex" xmlns:cx6="http://schemas.microsoft.com/office/drawing/2016/5/12/chartex" xmlns:cx7="http://schemas.microsoft.com/office/drawing/2016/5/13/chartex" xmlns:cx8="http://schemas.microsoft.com/office/drawing/2016/5/14/chartex" xmlns:mc="http://schemas.openxmlformats.org/markup-compatibility/2006" xmlns:aink="http://schemas.microsoft.com/office/drawing/2016/ink" xmlns:am3d="http://schemas.microsoft.com/office/drawing/2017/model3d" xmlns:o="urn:schemas-microsoft-com:office:office" xmlns:r="http://schemas.openxmlformats.org/officeDocument/2006/relationships" xmlns:m="http://schemas.openxmlformats.org/officeDocument/2006/math" xmlns:v="urn:schemas-microsoft-com:vml" xmlns:wp14="http://schemas.microsoft.com/office/word/2010/wordprocessingDrawing" xmlns:wp="http://schemas.openxmlformats.org/drawingml/2006/wordprocessingDrawing" xmlns:w10="urn:schemas-microsoft-com:office:word" xmlns:w="http://schemas.openxmlformats.org/wordprocessingml/2006/main" xmlns:w14="http://schemas.microsoft.com/office/word/2010/wordml" xmlns:w15="http://schemas.microsoft.com/office/word/2012/wordml" xmlns:w16cex="http://schemas.microsoft.com/office/word/2018/wordml/cex" xmlns:w16cid="http://schemas.microsoft.com/office/word/2016/wordml/cid" xmlns:w16="http://schemas.microsoft.com/office/word/2018/wordml" xmlns:w16sdtdh="http://schemas.microsoft.com/office/word/2020/wordml/sdtdatahash" xmlns:w16se="http://schemas.microsoft.com/office/word/2015/wordml/symex" xmlns:wpg="http://schemas.microsoft.com/office/word/2010/wordprocessingGroup" xmlns:wpi="http://schemas.microsoft.com/office/word/2010/wordprocessingInk" xmlns:wne="http://schemas.microsoft.com/office/word/2006/wordml" xmlns:wps="http://schemas.microsoft.com/office/word/2010/wordprocessingShape" mc:Ignorable="w14 w15 w16se w16cid w16 w16cex w16sdtdh wp14">
   <w:body>
     <w:p>
       <w:pPr>
         <w:pBdr>
-          <w:top w:val="single" w:color="auto" w:sz="4" w:space="1"/>
-          <w:left w:val="single" w:color="auto" w:sz="4" w:space="0"/>
-          <w:bottom w:val="single" w:color="auto" w:sz="4" w:space="1"/>
-          <w:right w:val="single" w:color="auto" w:sz="4" w:space="0"/>
+          <w:top w:val="single" w:sz="4" w:space="1" w:color="auto"/>
+          <w:left w:val="single" w:sz="4" w:space="0" w:color="auto"/>
+          <w:bottom w:val="single" w:sz="4" w:space="1" w:color="auto"/>
+          <w:right w:val="single" w:sz="4" w:space="0" w:color="auto"/>
         </w:pBdr>
         <w:shd w:val="clear" w:color="auto" w:fill="E7E6E6" w:themeFill="background2"/>
         <w:tabs>
@@ -32,7 +32,7 @@
           <w:sz w:val="28"/>
           <w:szCs w:val="28"/>
         </w:rPr>
-        <w:tab/>
+        <w:softHyphen/>
       </w:r>
       <w:r>
         <w:rPr>
@@ -42,16 +42,57 @@
           <w:sz w:val="28"/>
           <w:szCs w:val="28"/>
         </w:rPr>
+        <w:softHyphen/>
+      </w:r>
+      <w:r>
+        <w:rPr>
+          <w:rFonts w:ascii="Cambria Math" w:hAnsi="Cambria Math"/>
+          <w:b/>
+          <w:noProof/>
+          <w:sz w:val="28"/>
+          <w:szCs w:val="28"/>
+        </w:rPr>
+        <w:softHyphen/>
+      </w:r>
+      <w:r>
+        <w:rPr>
+          <w:rFonts w:ascii="Cambria Math" w:hAnsi="Cambria Math"/>
+          <w:b/>
+          <w:noProof/>
+          <w:sz w:val="28"/>
+          <w:szCs w:val="28"/>
+        </w:rPr>
+        <w:softHyphen/>
+      </w:r>
+      <w:r>
+        <w:rPr>
+          <w:rFonts w:ascii="Cambria Math" w:hAnsi="Cambria Math"/>
+          <w:b/>
+          <w:noProof/>
+          <w:sz w:val="28"/>
+          <w:szCs w:val="28"/>
+        </w:rPr>
+        <w:softHyphen/>
+      </w:r>
+      <w:r>
+        <w:rPr>
+          <w:rFonts w:ascii="Cambria Math" w:hAnsi="Cambria Math"/>
+          <w:b/>
+          <w:noProof/>
+          <w:sz w:val="28"/>
+          <w:szCs w:val="28"/>
+        </w:rPr>
+        <w:tab/>
         <w:t>Wir bearbeiten Störungsfälle (Incident Management)</w:t>
       </w:r>
     </w:p>
     <w:p>
       <w:pPr>
         <w:pBdr>
-          <w:top w:val="single" w:color="auto" w:sz="4" w:space="1"/>
-          <w:left w:val="single" w:color="auto" w:sz="4" w:space="0"/>
-          <w:bottom w:val="single" w:color="auto" w:sz="4" w:space="1"/>
-          <w:right w:val="single" w:color="auto" w:sz="4" w:space="0"/>
+          <w:top w:val="single" w:sz="4" w:space="1" w:color="auto"/>
+          <w:left w:val="single" w:sz="4" w:space="0" w:color="auto"/>
+          <w:bottom w:val="single" w:sz="4" w:space="1" w:color="auto"/>
+          <w:right w:val="single" w:sz="4" w:space="0" w:color="auto"/>
         </w:pBdr>
         <w:shd w:val="clear" w:color="auto" w:fill="E7E6E6" w:themeFill="background2"/>
         <w:tabs>
@@ -81,7 +122,7 @@
     </w:p>
     <w:p>
       <w:pPr>
-        <w:pStyle w:val="Listenabsatz"/>
+        <w:pStyle w:val="ListParagraph"/>
         <w:ind w:left="1776"/>
         <w:rPr>
           <w:rFonts w:ascii="Franklin Gothic Book" w:hAnsi="Franklin Gothic Book"/>
@@ -282,7 +323,7 @@
     </w:p>
     <w:p>
       <w:pPr>
-        <w:pStyle w:val="Listenabsatz"/>
+        <w:pStyle w:val="ListParagraph"/>
         <w:ind w:left="1776"/>
         <w:rPr>
           <w:rFonts w:ascii="Franklin Gothic Book" w:hAnsi="Franklin Gothic Book"/>
@@ -294,7 +335,7 @@
     </w:p>
     <w:tbl>
       <w:tblPr>
-        <w:tblStyle w:val="Tabellenraster"/>
+        <w:tblStyle w:val="TableGrid"/>
         <w:tblW w:w="10559" w:type="dxa"/>
         <w:tblLook w:val="04A0" w:firstRow="1" w:lastRow="0" w:firstColumn="1" w:lastColumn="0" w:noHBand="0" w:noVBand="1"/>
       </w:tblPr>
@@ -495,13 +536,23 @@
                 <w:color w:val="FF0000"/>
               </w:rPr>
             </w:pPr>
+            <w:r>
+              <w:rPr>
+                <w:color w:val="FF0000"/>
+              </w:rPr>
+              <w:t>Hardware</w:t>
+            </w:r>
           </w:p>
         </w:tc>
         <w:tc>
           <w:tcPr>
             <w:tcW w:w="856" w:type="dxa"/>
           </w:tcPr>
-          <w:p/>
+          <w:p>
+            <w:r>
+              <w:t>4</w:t>
+            </w:r>
+          </w:p>
         </w:tc>
       </w:tr>
       <w:tr>
@@ -558,13 +609,23 @@
                 <w:color w:val="FF0000"/>
               </w:rPr>
             </w:pPr>
+            <w:r>
+              <w:rPr>
+                <w:color w:val="FF0000"/>
+              </w:rPr>
+              <w:t>Netzwerk/Software</w:t>
+            </w:r>
           </w:p>
         </w:tc>
         <w:tc>
           <w:tcPr>
             <w:tcW w:w="856" w:type="dxa"/>
           </w:tcPr>
-          <w:p/>
+          <w:p>
+            <w:r>
+              <w:t>3</w:t>
+            </w:r>
+          </w:p>
         </w:tc>
       </w:tr>
       <w:tr>
@@ -621,13 +682,23 @@
                 <w:color w:val="FF0000"/>
               </w:rPr>
             </w:pPr>
+            <w:r>
+              <w:rPr>
+                <w:color w:val="FF0000"/>
+              </w:rPr>
+              <w:t>Hardware</w:t>
+            </w:r>
           </w:p>
         </w:tc>
         <w:tc>
           <w:tcPr>
             <w:tcW w:w="856" w:type="dxa"/>
           </w:tcPr>
-          <w:p/>
+          <w:p>
+            <w:r>
+              <w:t>3</w:t>
+            </w:r>
+          </w:p>
         </w:tc>
       </w:tr>
       <w:tr>
@@ -692,13 +763,23 @@
                 <w:color w:val="FF0000"/>
               </w:rPr>
             </w:pPr>
+            <w:r>
+              <w:rPr>
+                <w:color w:val="FF0000"/>
+              </w:rPr>
+              <w:t>Netzwerk/Software</w:t>
+            </w:r>
           </w:p>
         </w:tc>
         <w:tc>
           <w:tcPr>
             <w:tcW w:w="856" w:type="dxa"/>
           </w:tcPr>
-          <w:p/>
+          <w:p>
+            <w:r>
+              <w:t>2</w:t>
+            </w:r>
+          </w:p>
         </w:tc>
       </w:tr>
       <w:tr>
@@ -766,13 +847,23 @@
                 <w:color w:val="FF0000"/>
               </w:rPr>
             </w:pPr>
+            <w:r>
+              <w:rPr>
+                <w:color w:val="FF0000"/>
+              </w:rPr>
+              <w:t>Netzwerk/Software</w:t>
+            </w:r>
           </w:p>
         </w:tc>
         <w:tc>
           <w:tcPr>
             <w:tcW w:w="856" w:type="dxa"/>
           </w:tcPr>
-          <w:p/>
+          <w:p>
+            <w:r>
+              <w:t>1</w:t>
+            </w:r>
+          </w:p>
         </w:tc>
       </w:tr>
       <w:tr>
@@ -829,13 +920,23 @@
                 <w:color w:val="FF0000"/>
               </w:rPr>
             </w:pPr>
+            <w:r>
+              <w:rPr>
+                <w:color w:val="FF0000"/>
+              </w:rPr>
+              <w:t>Hardware/Software</w:t>
+            </w:r>
           </w:p>
         </w:tc>
         <w:tc>
           <w:tcPr>
             <w:tcW w:w="856" w:type="dxa"/>
           </w:tcPr>
-          <w:p/>
+          <w:p>
+            <w:r>
+              <w:t>2</w:t>
+            </w:r>
+          </w:p>
         </w:tc>
       </w:tr>
     </w:tbl>
@@ -949,7 +1050,7 @@
               </wp:anchor>
             </w:drawing>
           </mc:Choice>
-          <mc:Fallback>
+          <mc:Fallback xmlns:dgm="http://schemas.openxmlformats.org/drawingml/2006/diagram" xmlns:asvg="http://schemas.microsoft.com/office/drawing/2016/SVG/main" xmlns:a14="http://schemas.microsoft.com/office/drawing/2010/main" xmlns:pic="http://schemas.openxmlformats.org/drawingml/2006/picture" xmlns:a="http://schemas.openxmlformats.org/drawingml/2006/main">
             <w:pict w14:anchorId="66C4AE38">
               <v:rect id="Rechteck 7" style="position:absolute;margin-left:0;margin-top:13.2pt;width:525pt;height:249pt;z-index:251668480;visibility:visible;mso-wrap-style:square;mso-height-percent:0;mso-wrap-distance-left:9pt;mso-wrap-distance-top:0;mso-wrap-distance-right:9pt;mso-wrap-distance-bottom:0;mso-position-horizontal:left;mso-position-horizontal-relative:margin;mso-position-vertical:absolute;mso-position-vertical-relative:text;mso-height-percent:0;mso-height-relative:margin;v-text-anchor:middle" o:spid="_x0000_s1026" filled="f" strokecolor="black [3213]" strokeweight="1.25pt" w14:anchorId="29F05ECB" o:gfxdata="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">
                 <v:stroke dashstyle="1 1"/>
@@ -1049,7 +1150,7 @@
     </w:p>
     <w:p>
       <w:pPr>
-        <w:pStyle w:val="Listenabsatz"/>
+        <w:pStyle w:val="ListParagraph"/>
         <w:numPr>
           <w:ilvl w:val="0"/>
           <w:numId w:val="13"/>
@@ -1076,7 +1177,7 @@
     </w:p>
     <w:p>
       <w:pPr>
-        <w:pStyle w:val="Listenabsatz"/>
+        <w:pStyle w:val="ListParagraph"/>
         <w:rPr>
           <w:rFonts w:ascii="Franklin Gothic Book" w:hAnsi="Franklin Gothic Book"/>
           <w:bCs/>
@@ -1087,7 +1188,7 @@
     </w:p>
     <w:p>
       <w:pPr>
-        <w:pStyle w:val="Listenabsatz"/>
+        <w:pStyle w:val="ListParagraph"/>
         <w:numPr>
           <w:ilvl w:val="0"/>
           <w:numId w:val="1"/>
@@ -1114,7 +1215,7 @@
     </w:p>
     <w:p>
       <w:pPr>
-        <w:pStyle w:val="Listenabsatz"/>
+        <w:pStyle w:val="ListParagraph"/>
         <w:rPr>
           <w:rFonts w:ascii="Franklin Gothic Book" w:hAnsi="Franklin Gothic Book"/>
           <w:bCs/>
@@ -1123,7 +1224,7 @@
     </w:p>
     <w:p>
       <w:pPr>
-        <w:pStyle w:val="Listenabsatz"/>
+        <w:pStyle w:val="ListParagraph"/>
         <w:numPr>
           <w:ilvl w:val="0"/>
           <w:numId w:val="1"/>
@@ -1185,7 +1286,7 @@
     </w:p>
     <w:p>
       <w:pPr>
-        <w:pStyle w:val="Listenabsatz"/>
+        <w:pStyle w:val="ListParagraph"/>
         <w:rPr>
           <w:rFonts w:ascii="Franklin Gothic Book" w:hAnsi="Franklin Gothic Book"/>
           <w:bCs/>
@@ -1194,7 +1295,7 @@
     </w:p>
     <w:p>
       <w:pPr>
-        <w:pStyle w:val="Listenabsatz"/>
+        <w:pStyle w:val="ListParagraph"/>
         <w:numPr>
           <w:ilvl w:val="0"/>
           <w:numId w:val="1"/>
@@ -1293,7 +1394,7 @@
     </w:p>
     <w:p>
       <w:pPr>
-        <w:pStyle w:val="Listenabsatz"/>
+        <w:pStyle w:val="ListParagraph"/>
         <w:numPr>
           <w:ilvl w:val="0"/>
           <w:numId w:val="1"/>
@@ -1348,7 +1449,7 @@
     </w:p>
     <w:p>
       <w:pPr>
-        <w:pStyle w:val="Listenabsatz"/>
+        <w:pStyle w:val="ListParagraph"/>
         <w:rPr>
           <w:rFonts w:ascii="Franklin Gothic Book" w:hAnsi="Franklin Gothic Book"/>
           <w:bCs/>
@@ -1357,7 +1458,7 @@
     </w:p>
     <w:p>
       <w:pPr>
-        <w:pStyle w:val="Listenabsatz"/>
+        <w:pStyle w:val="ListParagraph"/>
         <w:numPr>
           <w:ilvl w:val="0"/>
           <w:numId w:val="1"/>
@@ -1512,7 +1613,7 @@
     </w:p>
     <w:p>
       <w:pPr>
-        <w:pStyle w:val="Listenabsatz"/>
+        <w:pStyle w:val="ListParagraph"/>
         <w:rPr>
           <w:b/>
           <w:bCs/>
@@ -1526,7 +1627,7 @@
         </w:rPr>
         <w:sectPr>
           <w:headerReference w:type="default" r:id="rId13"/>
-          <w:pgSz w:w="11906" w:h="16838" w:orient="portrait"/>
+          <w:pgSz w:w="11906" w:h="16838"/>
           <w:pgMar w:top="720" w:right="720" w:bottom="720" w:left="720" w:header="708" w:footer="708" w:gutter="0"/>
           <w:cols w:space="708"/>
           <w:docGrid w:linePitch="360"/>
@@ -1536,10 +1637,10 @@
     <w:p>
       <w:pPr>
         <w:pBdr>
-          <w:top w:val="single" w:color="auto" w:sz="4" w:space="1"/>
-          <w:left w:val="single" w:color="auto" w:sz="4" w:space="0"/>
-          <w:bottom w:val="single" w:color="auto" w:sz="4" w:space="1"/>
-          <w:right w:val="single" w:color="auto" w:sz="4" w:space="0"/>
+          <w:top w:val="single" w:sz="4" w:space="1" w:color="auto"/>
+          <w:left w:val="single" w:sz="4" w:space="0" w:color="auto"/>
+          <w:bottom w:val="single" w:sz="4" w:space="1" w:color="auto"/>
+          <w:right w:val="single" w:sz="4" w:space="0" w:color="auto"/>
         </w:pBdr>
         <w:shd w:val="clear" w:color="auto" w:fill="E7E6E6" w:themeFill="background2"/>
         <w:tabs>
@@ -1661,7 +1762,7 @@
               </wp:anchor>
             </w:drawing>
           </mc:Choice>
-          <mc:Fallback>
+          <mc:Fallback xmlns:dgm="http://schemas.openxmlformats.org/drawingml/2006/diagram" xmlns:asvg="http://schemas.microsoft.com/office/drawing/2016/SVG/main" xmlns:a14="http://schemas.microsoft.com/office/drawing/2010/main" xmlns:pic="http://schemas.openxmlformats.org/drawingml/2006/picture" xmlns:a="http://schemas.openxmlformats.org/drawingml/2006/main">
             <w:pict w14:anchorId="399EB033">
               <v:rect id="Rechteck 12" style="position:absolute;margin-left:473.8pt;margin-top:263pt;width:525pt;height:191.25pt;z-index:251672576;visibility:visible;mso-wrap-style:square;mso-height-percent:0;mso-wrap-distance-left:9pt;mso-wrap-distance-top:0;mso-wrap-distance-right:9pt;mso-wrap-distance-bottom:0;mso-position-horizontal:right;mso-position-horizontal-relative:margin;mso-position-vertical:absolute;mso-position-vertical-relative:text;mso-height-percent:0;mso-height-relative:margin;v-text-anchor:middle" o:spid="_x0000_s1026" filled="f" strokecolor="black [3213]" strokeweight="1.25pt" w14:anchorId="129D1A67" o:gfxdata="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">
                 <v:stroke dashstyle="1 1"/>
@@ -1772,7 +1873,7 @@
     </w:p>
     <w:p>
       <w:pPr>
-        <w:pStyle w:val="Listenabsatz"/>
+        <w:pStyle w:val="ListParagraph"/>
         <w:numPr>
           <w:ilvl w:val="0"/>
           <w:numId w:val="14"/>
@@ -1857,16 +1958,7 @@
           </wp:anchor>
         </w:drawing>
       </w:r>
-      <w:r>
-        <w:rPr>
-          <w:rFonts w:ascii="Franklin Gothic Book" w:hAnsi="Franklin Gothic Book"/>
-          <w:bCs/>
-          <w:iCs/>
-          <w:sz w:val="24"/>
-          <w:szCs w:val="24"/>
-        </w:rPr>
-        <w:t xml:space="preserve">Recherchieren Sie! </w:t>
-      </w:r>
+      <w:proofErr w:type="spellStart"/>
       <w:r>
         <w:rPr>
           <w:rFonts w:ascii="Franklin Gothic Book" w:hAnsi="Franklin Gothic Book"/>
@@ -1876,9 +1968,9 @@
           <w:szCs w:val="24"/>
           <w:lang w:val="en-US"/>
         </w:rPr>
-        <w:t xml:space="preserve">Was </w:t>
-      </w:r>
-      <w:proofErr w:type="spellStart"/>
+        <w:t>Recherchieren</w:t>
+      </w:r>
+      <w:proofErr w:type="spellEnd"/>
       <w:r>
         <w:rPr>
           <w:rFonts w:ascii="Franklin Gothic Book" w:hAnsi="Franklin Gothic Book"/>
@@ -1888,9 +1980,8 @@
           <w:szCs w:val="24"/>
           <w:lang w:val="en-US"/>
         </w:rPr>
-        <w:t>unterscheidet</w:t>
-      </w:r>
-      <w:proofErr w:type="spellEnd"/>
+        <w:t xml:space="preserve"> Sie! </w:t>
+      </w:r>
       <w:r>
         <w:rPr>
           <w:rFonts w:ascii="Franklin Gothic Book" w:hAnsi="Franklin Gothic Book"/>
@@ -1900,7 +1991,7 @@
           <w:szCs w:val="24"/>
           <w:lang w:val="en-US"/>
         </w:rPr>
-        <w:t xml:space="preserve"> Service Level Agreements (SLA) von Service Level Requirements (SLR), AGB, </w:t>
+        <w:t xml:space="preserve">Was </w:t>
       </w:r>
       <w:proofErr w:type="spellStart"/>
       <w:r>
@@ -1912,7 +2003,7 @@
           <w:szCs w:val="24"/>
           <w:lang w:val="en-US"/>
         </w:rPr>
-        <w:t>Projektverträgen</w:t>
+        <w:t>unterscheidet</w:t>
       </w:r>
       <w:proofErr w:type="spellEnd"/>
       <w:r>
@@ -1924,13 +2015,10 @@
           <w:szCs w:val="24"/>
           <w:lang w:val="en-US"/>
         </w:rPr>
-        <w:t xml:space="preserve">, Underpinning Contracts (UC) und Operation Level Agreements (OLA)? </w:t>
-      </w:r>
-    </w:p>
-    <w:p>
-      <w:pPr>
-        <w:pStyle w:val="Listenabsatz"/>
-        <w:ind w:left="1560"/>
+        <w:t xml:space="preserve"> Service Level Agreements (SLA) von Service Level Requirements (SLR), AGB, </w:t>
+      </w:r>
+      <w:proofErr w:type="spellStart"/>
+      <w:r>
         <w:rPr>
           <w:rFonts w:ascii="Franklin Gothic Book" w:hAnsi="Franklin Gothic Book"/>
           <w:bCs/>
@@ -1939,11 +2027,580 @@
           <w:szCs w:val="24"/>
           <w:lang w:val="en-US"/>
         </w:rPr>
+        <w:t>Projektverträgen</w:t>
+      </w:r>
+      <w:proofErr w:type="spellEnd"/>
+      <w:r>
+        <w:rPr>
+          <w:rFonts w:ascii="Franklin Gothic Book" w:hAnsi="Franklin Gothic Book"/>
+          <w:bCs/>
+          <w:iCs/>
+          <w:sz w:val="24"/>
+          <w:szCs w:val="24"/>
+          <w:lang w:val="en-US"/>
+        </w:rPr>
+        <w:t xml:space="preserve">, Underpinning Contracts (UC) und Operation Level Agreements (OLA)? </w:t>
+      </w:r>
+    </w:p>
+    <w:tbl>
+      <w:tblPr>
+        <w:tblStyle w:val="TableGrid"/>
+        <w:tblW w:w="0" w:type="auto"/>
+        <w:tblLook w:val="04A0" w:firstRow="1" w:lastRow="0" w:firstColumn="1" w:lastColumn="0" w:noHBand="0" w:noVBand="1"/>
+      </w:tblPr>
+      <w:tblGrid>
+        <w:gridCol w:w="1742"/>
+        <w:gridCol w:w="1742"/>
+        <w:gridCol w:w="1743"/>
+        <w:gridCol w:w="1743"/>
+        <w:gridCol w:w="1743"/>
+        <w:gridCol w:w="1743"/>
+      </w:tblGrid>
+      <w:tr>
+        <w:tc>
+          <w:tcPr>
+            <w:tcW w:w="1742" w:type="dxa"/>
+          </w:tcPr>
+          <w:p>
+            <w:pPr>
+              <w:rPr>
+                <w:rFonts w:ascii="Franklin Gothic Book" w:hAnsi="Franklin Gothic Book"/>
+                <w:bCs/>
+                <w:iCs/>
+                <w:sz w:val="24"/>
+                <w:szCs w:val="24"/>
+                <w:lang w:val="en-US"/>
+              </w:rPr>
+            </w:pPr>
+            <w:r>
+              <w:rPr>
+                <w:rFonts w:ascii="Franklin Gothic Book" w:hAnsi="Franklin Gothic Book"/>
+                <w:bCs/>
+                <w:iCs/>
+                <w:sz w:val="24"/>
+                <w:szCs w:val="24"/>
+                <w:lang w:val="en-US"/>
+              </w:rPr>
+              <w:t>SLA</w:t>
+            </w:r>
+          </w:p>
+        </w:tc>
+        <w:tc>
+          <w:tcPr>
+            <w:tcW w:w="1742" w:type="dxa"/>
+          </w:tcPr>
+          <w:p>
+            <w:pPr>
+              <w:rPr>
+                <w:rFonts w:ascii="Franklin Gothic Book" w:hAnsi="Franklin Gothic Book"/>
+                <w:bCs/>
+                <w:iCs/>
+                <w:sz w:val="24"/>
+                <w:szCs w:val="24"/>
+                <w:lang w:val="en-US"/>
+              </w:rPr>
+            </w:pPr>
+            <w:r>
+              <w:rPr>
+                <w:rFonts w:ascii="Franklin Gothic Book" w:hAnsi="Franklin Gothic Book"/>
+                <w:bCs/>
+                <w:iCs/>
+                <w:sz w:val="24"/>
+                <w:szCs w:val="24"/>
+                <w:lang w:val="en-US"/>
+              </w:rPr>
+              <w:t>SLR</w:t>
+            </w:r>
+          </w:p>
+        </w:tc>
+        <w:tc>
+          <w:tcPr>
+            <w:tcW w:w="1743" w:type="dxa"/>
+          </w:tcPr>
+          <w:p>
+            <w:pPr>
+              <w:rPr>
+                <w:rFonts w:ascii="Franklin Gothic Book" w:hAnsi="Franklin Gothic Book"/>
+                <w:bCs/>
+                <w:iCs/>
+                <w:sz w:val="24"/>
+                <w:szCs w:val="24"/>
+                <w:lang w:val="en-US"/>
+              </w:rPr>
+            </w:pPr>
+            <w:r>
+              <w:rPr>
+                <w:rFonts w:ascii="Franklin Gothic Book" w:hAnsi="Franklin Gothic Book"/>
+                <w:bCs/>
+                <w:iCs/>
+                <w:sz w:val="24"/>
+                <w:szCs w:val="24"/>
+                <w:lang w:val="en-US"/>
+              </w:rPr>
+              <w:t>AGB</w:t>
+            </w:r>
+          </w:p>
+        </w:tc>
+        <w:tc>
+          <w:tcPr>
+            <w:tcW w:w="1743" w:type="dxa"/>
+          </w:tcPr>
+          <w:p>
+            <w:pPr>
+              <w:rPr>
+                <w:rFonts w:ascii="Franklin Gothic Book" w:hAnsi="Franklin Gothic Book"/>
+                <w:bCs/>
+                <w:iCs/>
+                <w:sz w:val="24"/>
+                <w:szCs w:val="24"/>
+                <w:lang w:val="en-US"/>
+              </w:rPr>
+            </w:pPr>
+            <w:r>
+              <w:rPr>
+                <w:rFonts w:ascii="Franklin Gothic Book" w:hAnsi="Franklin Gothic Book"/>
+                <w:bCs/>
+                <w:iCs/>
+                <w:sz w:val="24"/>
+                <w:szCs w:val="24"/>
+              </w:rPr>
+              <w:t>Projektvertrag</w:t>
+            </w:r>
+          </w:p>
+        </w:tc>
+        <w:tc>
+          <w:tcPr>
+            <w:tcW w:w="1743" w:type="dxa"/>
+          </w:tcPr>
+          <w:p>
+            <w:pPr>
+              <w:rPr>
+                <w:rFonts w:ascii="Franklin Gothic Book" w:hAnsi="Franklin Gothic Book"/>
+                <w:bCs/>
+                <w:iCs/>
+                <w:sz w:val="24"/>
+                <w:szCs w:val="24"/>
+                <w:lang w:val="en-US"/>
+              </w:rPr>
+            </w:pPr>
+            <w:r>
+              <w:rPr>
+                <w:rFonts w:ascii="Franklin Gothic Book" w:hAnsi="Franklin Gothic Book"/>
+                <w:bCs/>
+                <w:iCs/>
+                <w:sz w:val="24"/>
+                <w:szCs w:val="24"/>
+                <w:lang w:val="en-US"/>
+              </w:rPr>
+              <w:t>U</w:t>
+            </w:r>
+            <w:r>
+              <w:rPr>
+                <w:rFonts w:ascii="Franklin Gothic Book" w:hAnsi="Franklin Gothic Book"/>
+                <w:bCs/>
+                <w:iCs/>
+                <w:sz w:val="24"/>
+                <w:szCs w:val="24"/>
+                <w:lang w:val="en-US"/>
+              </w:rPr>
+              <w:t>C</w:t>
+            </w:r>
+          </w:p>
+        </w:tc>
+        <w:tc>
+          <w:tcPr>
+            <w:tcW w:w="1743" w:type="dxa"/>
+          </w:tcPr>
+          <w:p>
+            <w:pPr>
+              <w:rPr>
+                <w:rFonts w:ascii="Franklin Gothic Book" w:hAnsi="Franklin Gothic Book"/>
+                <w:bCs/>
+                <w:iCs/>
+                <w:sz w:val="24"/>
+                <w:szCs w:val="24"/>
+                <w:lang w:val="en-US"/>
+              </w:rPr>
+            </w:pPr>
+            <w:r>
+              <w:rPr>
+                <w:rFonts w:ascii="Franklin Gothic Book" w:hAnsi="Franklin Gothic Book"/>
+                <w:bCs/>
+                <w:iCs/>
+                <w:sz w:val="24"/>
+                <w:szCs w:val="24"/>
+                <w:lang w:val="en-US"/>
+              </w:rPr>
+              <w:t>OLA</w:t>
+            </w:r>
+          </w:p>
+        </w:tc>
+      </w:tr>
+      <w:tr>
+        <w:tc>
+          <w:tcPr>
+            <w:tcW w:w="1742" w:type="dxa"/>
+          </w:tcPr>
+          <w:p>
+            <w:pPr>
+              <w:rPr>
+                <w:rFonts w:ascii="Franklin Gothic Book" w:hAnsi="Franklin Gothic Book"/>
+                <w:bCs/>
+                <w:iCs/>
+                <w:sz w:val="24"/>
+                <w:szCs w:val="24"/>
+              </w:rPr>
+            </w:pPr>
+            <w:r>
+              <w:rPr>
+                <w:rFonts w:ascii="Franklin Gothic Book" w:hAnsi="Franklin Gothic Book"/>
+                <w:bCs/>
+                <w:iCs/>
+                <w:sz w:val="24"/>
+                <w:szCs w:val="24"/>
+              </w:rPr>
+              <w:t xml:space="preserve">Rahmenvertrag </w:t>
+            </w:r>
+            <w:r>
+              <w:rPr>
+                <w:rFonts w:ascii="Franklin Gothic Book" w:hAnsi="Franklin Gothic Book"/>
+                <w:bCs/>
+                <w:iCs/>
+                <w:sz w:val="24"/>
+                <w:szCs w:val="24"/>
+              </w:rPr>
+              <w:t>für Dienstleistung zwischen Auftraggeber und Dienstleist</w:t>
+            </w:r>
+            <w:r>
+              <w:rPr>
+                <w:rFonts w:ascii="Franklin Gothic Book" w:hAnsi="Franklin Gothic Book"/>
+                <w:bCs/>
+                <w:iCs/>
+                <w:sz w:val="24"/>
+                <w:szCs w:val="24"/>
+              </w:rPr>
+              <w:t xml:space="preserve">ungsgeber, „in welcher </w:t>
+            </w:r>
+            <w:r>
+              <w:rPr>
+                <w:rFonts w:ascii="Franklin Gothic Book" w:hAnsi="Franklin Gothic Book"/>
+                <w:b/>
+                <w:bCs/>
+                <w:iCs/>
+                <w:sz w:val="24"/>
+                <w:szCs w:val="24"/>
+              </w:rPr>
+              <w:t>Qualität</w:t>
+            </w:r>
+            <w:r>
+              <w:rPr>
+                <w:rFonts w:ascii="Franklin Gothic Book" w:hAnsi="Franklin Gothic Book"/>
+                <w:bCs/>
+                <w:iCs/>
+                <w:sz w:val="24"/>
+                <w:szCs w:val="24"/>
+              </w:rPr>
+              <w:t xml:space="preserve"> muss eine bestimmte </w:t>
+            </w:r>
+            <w:proofErr w:type="spellStart"/>
+            <w:r>
+              <w:rPr>
+                <w:rFonts w:ascii="Franklin Gothic Book" w:hAnsi="Franklin Gothic Book"/>
+                <w:bCs/>
+                <w:iCs/>
+                <w:sz w:val="24"/>
+                <w:szCs w:val="24"/>
+              </w:rPr>
+              <w:t>Dientleistung</w:t>
+            </w:r>
+            <w:proofErr w:type="spellEnd"/>
+            <w:r>
+              <w:rPr>
+                <w:rFonts w:ascii="Franklin Gothic Book" w:hAnsi="Franklin Gothic Book"/>
+                <w:bCs/>
+                <w:iCs/>
+                <w:sz w:val="24"/>
+                <w:szCs w:val="24"/>
+              </w:rPr>
+              <w:t xml:space="preserve"> </w:t>
+            </w:r>
+            <w:r>
+              <w:rPr>
+                <w:rFonts w:ascii="Franklin Gothic Book" w:hAnsi="Franklin Gothic Book"/>
+                <w:bCs/>
+                <w:iCs/>
+                <w:sz w:val="24"/>
+                <w:szCs w:val="24"/>
+              </w:rPr>
+              <w:t>erbracht werden“</w:t>
+            </w:r>
+          </w:p>
+        </w:tc>
+        <w:tc>
+          <w:tcPr>
+            <w:tcW w:w="1742" w:type="dxa"/>
+          </w:tcPr>
+          <w:p>
+            <w:pPr>
+              <w:rPr>
+                <w:rFonts w:ascii="Franklin Gothic Book" w:hAnsi="Franklin Gothic Book"/>
+                <w:bCs/>
+                <w:iCs/>
+                <w:sz w:val="24"/>
+                <w:szCs w:val="24"/>
+              </w:rPr>
+            </w:pPr>
+            <w:r>
+              <w:rPr>
+                <w:rFonts w:ascii="Franklin Gothic Book" w:hAnsi="Franklin Gothic Book"/>
+                <w:bCs/>
+                <w:iCs/>
+                <w:sz w:val="24"/>
+                <w:szCs w:val="24"/>
+              </w:rPr>
+              <w:t xml:space="preserve">Erwartungen </w:t>
+            </w:r>
+            <w:r>
+              <w:rPr>
+                <w:rFonts w:ascii="Franklin Gothic Book" w:hAnsi="Franklin Gothic Book"/>
+                <w:bCs/>
+                <w:iCs/>
+                <w:sz w:val="24"/>
+                <w:szCs w:val="24"/>
+              </w:rPr>
+              <w:t>des</w:t>
+            </w:r>
+            <w:r>
+              <w:rPr>
+                <w:rFonts w:ascii="Franklin Gothic Book" w:hAnsi="Franklin Gothic Book"/>
+                <w:bCs/>
+                <w:iCs/>
+                <w:sz w:val="24"/>
+                <w:szCs w:val="24"/>
+              </w:rPr>
+              <w:t xml:space="preserve"> Kunden. Beschreibt </w:t>
+            </w:r>
+            <w:r>
+              <w:rPr>
+                <w:rFonts w:ascii="Franklin Gothic Book" w:hAnsi="Franklin Gothic Book"/>
+                <w:bCs/>
+                <w:iCs/>
+                <w:sz w:val="24"/>
+                <w:szCs w:val="24"/>
+              </w:rPr>
+              <w:t>die benötigte Leistung als Basis der SLA.</w:t>
+            </w:r>
+          </w:p>
+        </w:tc>
+        <w:tc>
+          <w:tcPr>
+            <w:tcW w:w="1743" w:type="dxa"/>
+          </w:tcPr>
+          <w:p>
+            <w:pPr>
+              <w:rPr>
+                <w:rFonts w:ascii="Franklin Gothic Book" w:hAnsi="Franklin Gothic Book"/>
+                <w:bCs/>
+                <w:iCs/>
+                <w:sz w:val="24"/>
+                <w:szCs w:val="24"/>
+              </w:rPr>
+            </w:pPr>
+            <w:r>
+              <w:rPr>
+                <w:rFonts w:ascii="Roboto" w:hAnsi="Roboto"/>
+                <w:color w:val="1A1A1A"/>
+                <w:shd w:val="clear" w:color="auto" w:fill="FFFFFF"/>
+              </w:rPr>
+              <w:t xml:space="preserve">Allgemeine Geschäftsbedingungen (AGB) sind vorformulierten Vertragsbedingungen, </w:t>
+            </w:r>
+            <w:r>
+              <w:rPr>
+                <w:rFonts w:ascii="Roboto" w:hAnsi="Roboto"/>
+                <w:color w:val="1A1A1A"/>
+                <w:shd w:val="clear" w:color="auto" w:fill="FFFFFF"/>
+              </w:rPr>
+              <w:t>die für alle Kunden gelten.</w:t>
+            </w:r>
+          </w:p>
+        </w:tc>
+        <w:tc>
+          <w:tcPr>
+            <w:tcW w:w="1743" w:type="dxa"/>
+          </w:tcPr>
+          <w:p>
+            <w:pPr>
+              <w:rPr>
+                <w:rFonts w:ascii="Franklin Gothic Book" w:hAnsi="Franklin Gothic Book"/>
+                <w:bCs/>
+                <w:iCs/>
+                <w:sz w:val="24"/>
+                <w:szCs w:val="24"/>
+              </w:rPr>
+            </w:pPr>
+            <w:r>
+              <w:rPr>
+                <w:rFonts w:ascii="Franklin Gothic Book" w:hAnsi="Franklin Gothic Book"/>
+                <w:bCs/>
+                <w:iCs/>
+                <w:sz w:val="24"/>
+                <w:szCs w:val="24"/>
+              </w:rPr>
+              <w:t xml:space="preserve">Individuelle Vereinbarung zwischen </w:t>
+            </w:r>
+            <w:r>
+              <w:rPr>
+                <w:rFonts w:ascii="Franklin Gothic Book" w:hAnsi="Franklin Gothic Book"/>
+                <w:bCs/>
+                <w:iCs/>
+                <w:sz w:val="24"/>
+                <w:szCs w:val="24"/>
+              </w:rPr>
+              <w:t xml:space="preserve">Auftraggeber und -nehmer, der auf </w:t>
+            </w:r>
+            <w:r>
+              <w:rPr>
+                <w:rFonts w:ascii="Franklin Gothic Book" w:hAnsi="Franklin Gothic Book"/>
+                <w:bCs/>
+                <w:iCs/>
+                <w:sz w:val="24"/>
+                <w:szCs w:val="24"/>
+              </w:rPr>
+              <w:t>ein ganz bestimmtes Ziel ausgelegt ist</w:t>
+            </w:r>
+            <w:r>
+              <w:rPr>
+                <w:rFonts w:ascii="Franklin Gothic Book" w:hAnsi="Franklin Gothic Book"/>
+                <w:bCs/>
+                <w:iCs/>
+                <w:sz w:val="24"/>
+                <w:szCs w:val="24"/>
+              </w:rPr>
+              <w:t>. (Werkvertrag NICHT Dienstleistungsvertrag)</w:t>
+            </w:r>
+          </w:p>
+        </w:tc>
+        <w:tc>
+          <w:tcPr>
+            <w:tcW w:w="1743" w:type="dxa"/>
+          </w:tcPr>
+          <w:p>
+            <w:pPr>
+              <w:rPr>
+                <w:rFonts w:ascii="Franklin Gothic Book" w:hAnsi="Franklin Gothic Book"/>
+                <w:bCs/>
+                <w:iCs/>
+                <w:sz w:val="24"/>
+                <w:szCs w:val="24"/>
+              </w:rPr>
+            </w:pPr>
+            <w:r>
+              <w:rPr>
+                <w:rFonts w:ascii="Franklin Gothic Book" w:hAnsi="Franklin Gothic Book"/>
+                <w:bCs/>
+                <w:iCs/>
+                <w:sz w:val="24"/>
+                <w:szCs w:val="24"/>
+              </w:rPr>
+              <w:t xml:space="preserve">Vertrag mit einem externen Dienstleister </w:t>
+            </w:r>
+            <w:r>
+              <w:rPr>
+                <w:rFonts w:ascii="Franklin Gothic Book" w:hAnsi="Franklin Gothic Book"/>
+                <w:bCs/>
+                <w:iCs/>
+                <w:sz w:val="24"/>
+                <w:szCs w:val="24"/>
+              </w:rPr>
+              <w:t>(SLA mit Drittpartei).</w:t>
+            </w:r>
+          </w:p>
+        </w:tc>
+        <w:tc>
+          <w:tcPr>
+            <w:tcW w:w="1743" w:type="dxa"/>
+          </w:tcPr>
+          <w:p>
+            <w:pPr>
+              <w:rPr>
+                <w:rFonts w:ascii="Franklin Gothic Book" w:hAnsi="Franklin Gothic Book"/>
+                <w:bCs/>
+                <w:iCs/>
+                <w:sz w:val="24"/>
+                <w:szCs w:val="24"/>
+              </w:rPr>
+            </w:pPr>
+            <w:r>
+              <w:rPr>
+                <w:rFonts w:ascii="Franklin Gothic Book" w:hAnsi="Franklin Gothic Book"/>
+                <w:bCs/>
+                <w:iCs/>
+                <w:sz w:val="24"/>
+                <w:szCs w:val="24"/>
+              </w:rPr>
+              <w:t>Unternehmensinterne Vereinbarung mit Leistung</w:t>
+            </w:r>
+            <w:r>
+              <w:rPr>
+                <w:rFonts w:ascii="Franklin Gothic Book" w:hAnsi="Franklin Gothic Book"/>
+                <w:bCs/>
+                <w:iCs/>
+                <w:sz w:val="24"/>
+                <w:szCs w:val="24"/>
+              </w:rPr>
+              <w:t>serbringer z.B. Supportabteilung</w:t>
+            </w:r>
+            <w:r>
+              <w:rPr>
+                <w:rFonts w:ascii="Franklin Gothic Book" w:hAnsi="Franklin Gothic Book"/>
+                <w:bCs/>
+                <w:iCs/>
+                <w:sz w:val="24"/>
+                <w:szCs w:val="24"/>
+              </w:rPr>
+              <w:t xml:space="preserve"> </w:t>
+            </w:r>
+            <w:r>
+              <w:rPr>
+                <w:rFonts w:ascii="Franklin Gothic Book" w:hAnsi="Franklin Gothic Book"/>
+                <w:bCs/>
+                <w:iCs/>
+                <w:sz w:val="24"/>
+                <w:szCs w:val="24"/>
+              </w:rPr>
+              <w:t>(SLA in der eigenen Firma)</w:t>
+            </w:r>
+          </w:p>
+        </w:tc>
+      </w:tr>
+    </w:tbl>
+    <w:p>
+      <w:pPr>
+        <w:rPr>
+          <w:rFonts w:ascii="Franklin Gothic Book" w:hAnsi="Franklin Gothic Book"/>
+          <w:bCs/>
+          <w:iCs/>
+          <w:sz w:val="24"/>
+          <w:szCs w:val="24"/>
+        </w:rPr>
       </w:pPr>
     </w:p>
     <w:p>
       <w:pPr>
-        <w:pStyle w:val="Listenabsatz"/>
+        <w:pStyle w:val="ListParagraph"/>
+        <w:ind w:left="1560"/>
+        <w:rPr>
+          <w:rFonts w:ascii="Franklin Gothic Book" w:hAnsi="Franklin Gothic Book"/>
+          <w:bCs/>
+          <w:iCs/>
+          <w:sz w:val="24"/>
+          <w:szCs w:val="24"/>
+        </w:rPr>
+      </w:pPr>
+    </w:p>
+    <w:p>
+      <w:pPr>
+        <w:pStyle w:val="ListParagraph"/>
         <w:numPr>
           <w:ilvl w:val="0"/>
           <w:numId w:val="14"/>
@@ -2031,8 +2688,6 @@
     </w:p>
     <w:p>
       <w:pPr>
-        <w:pStyle w:val="Listenabsatz"/>
-        <w:ind w:left="1560"/>
         <w:rPr>
           <w:rFonts w:ascii="Franklin Gothic Book" w:hAnsi="Franklin Gothic Book"/>
           <w:bCs/>
@@ -2040,22 +2695,15 @@
           <w:szCs w:val="24"/>
         </w:rPr>
       </w:pPr>
-    </w:p>
-    <w:p>
-      <w:pPr>
-        <w:pStyle w:val="Listenabsatz"/>
-        <w:numPr>
-          <w:ilvl w:val="0"/>
-          <w:numId w:val="14"/>
-        </w:numPr>
-        <w:ind w:left="1560"/>
+      <w:r>
         <w:rPr>
           <w:rFonts w:ascii="Franklin Gothic Book" w:hAnsi="Franklin Gothic Book"/>
           <w:bCs/>
           <w:sz w:val="24"/>
           <w:szCs w:val="24"/>
         </w:rPr>
-      </w:pPr>
+        <w:t xml:space="preserve">Die </w:t>
+      </w:r>
       <w:r>
         <w:rPr>
           <w:rFonts w:ascii="Franklin Gothic Book" w:hAnsi="Franklin Gothic Book"/>
@@ -2063,7 +2711,7 @@
           <w:sz w:val="24"/>
           <w:szCs w:val="24"/>
         </w:rPr>
-        <w:t>Ve</w:t>
+        <w:t>Dienstleistungsqualität</w:t>
       </w:r>
       <w:r>
         <w:rPr>
@@ -2072,7 +2720,7 @@
           <w:sz w:val="24"/>
           <w:szCs w:val="24"/>
         </w:rPr>
-        <w:t>r</w:t>
+        <w:t xml:space="preserve"> </w:t>
       </w:r>
       <w:r>
         <w:rPr>
@@ -2081,95 +2729,14 @@
           <w:sz w:val="24"/>
           <w:szCs w:val="24"/>
         </w:rPr>
-        <w:t>gleichen Sie ihr</w:t>
-      </w:r>
-      <w:r>
-        <w:rPr>
-          <w:rFonts w:ascii="Franklin Gothic Book" w:hAnsi="Franklin Gothic Book"/>
-          <w:bCs/>
-          <w:sz w:val="24"/>
-          <w:szCs w:val="24"/>
-        </w:rPr>
-        <w:t>e</w:t>
-      </w:r>
-      <w:r>
-        <w:rPr>
-          <w:rFonts w:ascii="Franklin Gothic Book" w:hAnsi="Franklin Gothic Book"/>
-          <w:bCs/>
-          <w:sz w:val="24"/>
-          <w:szCs w:val="24"/>
-        </w:rPr>
-        <w:t xml:space="preserve"> </w:t>
-      </w:r>
-      <w:r>
-        <w:rPr>
-          <w:rFonts w:ascii="Franklin Gothic Book" w:hAnsi="Franklin Gothic Book"/>
-          <w:bCs/>
-          <w:sz w:val="24"/>
-          <w:szCs w:val="24"/>
-        </w:rPr>
-        <w:t>Leistungsbeschreibung</w:t>
-      </w:r>
-      <w:r>
-        <w:rPr>
-          <w:rFonts w:ascii="Franklin Gothic Book" w:hAnsi="Franklin Gothic Book"/>
-          <w:bCs/>
-          <w:sz w:val="24"/>
-          <w:szCs w:val="24"/>
-        </w:rPr>
-        <w:t xml:space="preserve"> mit den </w:t>
-      </w:r>
-      <w:r>
-        <w:rPr>
-          <w:rFonts w:ascii="Franklin Gothic Book" w:hAnsi="Franklin Gothic Book"/>
-          <w:bCs/>
-          <w:sz w:val="24"/>
-          <w:szCs w:val="24"/>
-        </w:rPr>
-        <w:t>g</w:t>
-      </w:r>
-      <w:r>
-        <w:rPr>
-          <w:rFonts w:ascii="Franklin Gothic Book" w:hAnsi="Franklin Gothic Book"/>
-          <w:bCs/>
-          <w:sz w:val="24"/>
-          <w:szCs w:val="24"/>
-        </w:rPr>
-        <w:t xml:space="preserve">rundlegenden Vertragsinhalten von SLA. </w:t>
-      </w:r>
-      <w:r>
-        <w:rPr>
-          <w:rFonts w:ascii="Franklin Gothic Book" w:hAnsi="Franklin Gothic Book"/>
-          <w:bCs/>
-          <w:sz w:val="24"/>
-          <w:szCs w:val="24"/>
-        </w:rPr>
-        <w:t>Welche Informationen fehlen</w:t>
-      </w:r>
-      <w:r>
-        <w:rPr>
-          <w:rFonts w:ascii="Franklin Gothic Book" w:hAnsi="Franklin Gothic Book"/>
-          <w:bCs/>
-          <w:sz w:val="24"/>
-          <w:szCs w:val="24"/>
-        </w:rPr>
-        <w:t>/müssen ergänzt werden</w:t>
-      </w:r>
-      <w:r>
-        <w:rPr>
-          <w:rFonts w:ascii="Franklin Gothic Book" w:hAnsi="Franklin Gothic Book"/>
-          <w:bCs/>
-          <w:sz w:val="24"/>
-          <w:szCs w:val="24"/>
-        </w:rPr>
-        <w:t>?</w:t>
+        <w:t>wird klar definiert und kann somit stätig gemessen und verbessert werden,</w:t>
       </w:r>
     </w:p>
     <w:p/>
     <w:p>
       <w:pPr>
         <w:sectPr>
-          <w:pgSz w:w="11906" w:h="16838" w:orient="portrait"/>
+          <w:pgSz w:w="11906" w:h="16838"/>
           <w:pgMar w:top="720" w:right="720" w:bottom="720" w:left="720" w:header="708" w:footer="708" w:gutter="0"/>
           <w:cols w:space="708"/>
           <w:docGrid w:linePitch="360"/>
@@ -2179,10 +2746,10 @@
     <w:p>
       <w:pPr>
         <w:pBdr>
-          <w:top w:val="single" w:color="auto" w:sz="4" w:space="1"/>
-          <w:left w:val="single" w:color="auto" w:sz="4" w:space="0"/>
-          <w:bottom w:val="single" w:color="auto" w:sz="4" w:space="1"/>
-          <w:right w:val="single" w:color="auto" w:sz="4" w:space="0"/>
+          <w:top w:val="single" w:sz="4" w:space="1" w:color="auto"/>
+          <w:left w:val="single" w:sz="4" w:space="0" w:color="auto"/>
+          <w:bottom w:val="single" w:sz="4" w:space="1" w:color="auto"/>
+          <w:right w:val="single" w:sz="4" w:space="0" w:color="auto"/>
         </w:pBdr>
         <w:shd w:val="clear" w:color="auto" w:fill="E7E6E6" w:themeFill="background2"/>
         <w:tabs>
@@ -2272,7 +2839,7 @@
               </wp:anchor>
             </w:drawing>
           </mc:Choice>
-          <mc:Fallback>
+          <mc:Fallback xmlns:dgm="http://schemas.openxmlformats.org/drawingml/2006/diagram" xmlns:asvg="http://schemas.microsoft.com/office/drawing/2016/SVG/main" xmlns:a14="http://schemas.microsoft.com/office/drawing/2010/main" xmlns:pic="http://schemas.openxmlformats.org/drawingml/2006/picture" xmlns:a="http://schemas.openxmlformats.org/drawingml/2006/main">
             <w:pict w14:anchorId="2581C980">
               <v:rect id="Rechteck 14" style="position:absolute;margin-left:0;margin-top:26.75pt;width:525pt;height:128.25pt;z-index:251676672;visibility:visible;mso-wrap-style:square;mso-height-percent:0;mso-wrap-distance-left:9pt;mso-wrap-distance-top:0;mso-wrap-distance-right:9pt;mso-wrap-distance-bottom:0;mso-position-horizontal:left;mso-position-horizontal-relative:margin;mso-position-vertical:absolute;mso-position-vertical-relative:text;mso-height-percent:0;mso-height-relative:margin;v-text-anchor:middle" o:spid="_x0000_s1026" filled="f" strokecolor="black [3213]" strokeweight="1.25pt" w14:anchorId="69E5D3C7" o:gfxdata="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">
                 <v:stroke dashstyle="1 1"/>
@@ -2402,7 +2969,7 @@
     </w:p>
     <w:p>
       <w:pPr>
-        <w:pStyle w:val="Listenabsatz"/>
+        <w:pStyle w:val="ListParagraph"/>
         <w:numPr>
           <w:ilvl w:val="0"/>
           <w:numId w:val="12"/>
@@ -2560,7 +3127,7 @@
     </w:p>
     <w:p>
       <w:pPr>
-        <w:pStyle w:val="Listenabsatz"/>
+        <w:pStyle w:val="ListParagraph"/>
         <w:ind w:left="1505"/>
         <w:rPr>
           <w:rFonts w:ascii="Franklin Gothic Book" w:hAnsi="Franklin Gothic Book"/>
@@ -2572,7 +3139,7 @@
     </w:p>
     <w:p>
       <w:pPr>
-        <w:pStyle w:val="Listenabsatz"/>
+        <w:pStyle w:val="ListParagraph"/>
         <w:numPr>
           <w:ilvl w:val="0"/>
           <w:numId w:val="12"/>
@@ -2953,63 +3520,42 @@
       <w:pPr>
         <w:spacing w:after="0"/>
         <w:jc w:val="right"/>
-        <w:rPr>
-          <w:lang w:val="en-US"/>
-        </w:rPr>
       </w:pPr>
     </w:p>
     <w:p>
       <w:pPr>
         <w:spacing w:after="0"/>
         <w:jc w:val="right"/>
-        <w:rPr>
-          <w:lang w:val="en-US"/>
-        </w:rPr>
       </w:pPr>
     </w:p>
     <w:p>
       <w:pPr>
         <w:spacing w:after="0"/>
         <w:jc w:val="right"/>
-        <w:rPr>
-          <w:lang w:val="en-US"/>
-        </w:rPr>
       </w:pPr>
     </w:p>
     <w:p>
       <w:pPr>
         <w:spacing w:after="0"/>
         <w:jc w:val="right"/>
-        <w:rPr>
-          <w:lang w:val="en-US"/>
-        </w:rPr>
       </w:pPr>
     </w:p>
     <w:p>
       <w:pPr>
         <w:spacing w:after="0"/>
         <w:jc w:val="right"/>
-        <w:rPr>
-          <w:lang w:val="en-US"/>
-        </w:rPr>
       </w:pPr>
     </w:p>
     <w:p>
       <w:pPr>
         <w:spacing w:after="0"/>
         <w:jc w:val="right"/>
-        <w:rPr>
-          <w:lang w:val="en-US"/>
-        </w:rPr>
       </w:pPr>
     </w:p>
     <w:p>
       <w:pPr>
         <w:spacing w:after="0"/>
         <w:jc w:val="right"/>
-        <w:rPr>
-          <w:lang w:val="en-US"/>
-        </w:rPr>
       </w:pPr>
     </w:p>
     <w:p>
@@ -3105,9 +3651,10 @@
         <w:rPr>
           <w:sz w:val="40"/>
           <w:szCs w:val="40"/>
+          <w:lang w:val="en-US"/>
         </w:rPr>
         <w:sectPr>
-          <w:pgSz w:w="11906" w:h="16838" w:orient="portrait"/>
+          <w:pgSz w:w="11906" w:h="16838"/>
           <w:pgMar w:top="720" w:right="720" w:bottom="720" w:left="720" w:header="708" w:footer="708" w:gutter="0"/>
           <w:cols w:space="708"/>
           <w:docGrid w:linePitch="360"/>
@@ -3117,10 +3664,10 @@
     <w:p>
       <w:pPr>
         <w:pBdr>
-          <w:top w:val="single" w:color="auto" w:sz="4" w:space="1"/>
-          <w:left w:val="single" w:color="auto" w:sz="4" w:space="0"/>
-          <w:bottom w:val="single" w:color="auto" w:sz="4" w:space="1"/>
-          <w:right w:val="single" w:color="auto" w:sz="4" w:space="0"/>
+          <w:top w:val="single" w:sz="4" w:space="1" w:color="auto"/>
+          <w:left w:val="single" w:sz="4" w:space="0" w:color="auto"/>
+          <w:bottom w:val="single" w:sz="4" w:space="1" w:color="auto"/>
+          <w:right w:val="single" w:sz="4" w:space="0" w:color="auto"/>
         </w:pBdr>
         <w:shd w:val="clear" w:color="auto" w:fill="E7E6E6" w:themeFill="background2"/>
         <w:tabs>
@@ -3257,27 +3804,13 @@
         <w:rPr>
           <w:lang w:val="en-US"/>
         </w:rPr>
-        <w:t>Quelle: blog.concurrency.com/blog/june-2019/impact-urgency-matrix-</w:t>
-      </w:r>
-      <w:proofErr w:type="gramStart"/>
+        <w:t>Quelle: blog.concurrency.com/blog/june-2019/impact-urgency-matrix-defined!</w:t>
+      </w:r>
       <w:r>
         <w:rPr>
           <w:lang w:val="en-US"/>
         </w:rPr>
-        <w:t>defined!</w:t>
-      </w:r>
-      <w:r>
-        <w:rPr>
-          <w:lang w:val="en-US"/>
-        </w:rPr>
-        <w:t>,</w:t>
-      </w:r>
-      <w:proofErr w:type="gramEnd"/>
-      <w:r>
-        <w:rPr>
-          <w:lang w:val="en-US"/>
-        </w:rPr>
-        <w:t xml:space="preserve"> Jan. 2022</w:t>
+        <w:t>, Jan. 2022</w:t>
       </w:r>
     </w:p>
     <w:p>
@@ -3301,7 +3834,7 @@
     </w:p>
     <w:tbl>
       <w:tblPr>
-        <w:tblStyle w:val="Tabellenraster"/>
+        <w:tblStyle w:val="TableGrid"/>
         <w:tblW w:w="0" w:type="auto"/>
         <w:tblInd w:w="-5" w:type="dxa"/>
         <w:tblLook w:val="04A0" w:firstRow="1" w:lastRow="0" w:firstColumn="1" w:lastColumn="0" w:noHBand="0" w:noVBand="1"/>
@@ -3317,11 +3850,10 @@
         <w:tc>
           <w:tcPr>
             <w:tcW w:w="5221" w:type="dxa"/>
-            <w:tcMar/>
           </w:tcPr>
           <w:p>
             <w:pPr>
-              <w:pStyle w:val="Listenabsatz"/>
+              <w:pStyle w:val="ListParagraph"/>
               <w:ind w:left="0"/>
               <w:rPr>
                 <w:rFonts w:ascii="Franklin Gothic Book" w:hAnsi="Franklin Gothic Book"/>
@@ -3362,7 +3894,7 @@
           </w:p>
           <w:p>
             <w:pPr>
-              <w:pStyle w:val="Listenabsatz"/>
+              <w:pStyle w:val="ListParagraph"/>
               <w:ind w:left="0"/>
               <w:rPr>
                 <w:rFonts w:ascii="Franklin Gothic Book" w:hAnsi="Franklin Gothic Book"/>
@@ -3377,7 +3909,7 @@
           </w:p>
           <w:p>
             <w:pPr>
-              <w:pStyle w:val="Listenabsatz"/>
+              <w:pStyle w:val="ListParagraph"/>
               <w:numPr>
                 <w:ilvl w:val="0"/>
                 <w:numId w:val="2"/>
@@ -3423,15 +3955,15 @@
           </w:p>
           <w:p>
             <w:pPr>
-              <w:pStyle w:val="Listenabsatz"/>
+              <w:pStyle w:val="ListParagraph"/>
               <w:numPr>
                 <w:ilvl w:val="0"/>
                 <w:numId w:val="2"/>
               </w:numPr>
               <w:rPr>
                 <w:rFonts w:ascii="Franklin Gothic Book" w:hAnsi="Franklin Gothic Book"/>
-                <w:i w:val="1"/>
-                <w:iCs w:val="1"/>
+                <w:i/>
+                <w:iCs/>
                 <w:sz w:val="24"/>
                 <w:szCs w:val="24"/>
               </w:rPr>
@@ -3439,8 +3971,8 @@
             <w:r>
               <w:rPr>
                 <w:rFonts w:ascii="Franklin Gothic Book" w:hAnsi="Franklin Gothic Book"/>
-                <w:i w:val="1"/>
-                <w:iCs w:val="1"/>
+                <w:i/>
+                <w:iCs/>
                 <w:sz w:val="24"/>
                 <w:szCs w:val="24"/>
               </w:rPr>
@@ -3449,7 +3981,7 @@
           </w:p>
           <w:p>
             <w:pPr>
-              <w:pStyle w:val="Listenabsatz"/>
+              <w:pStyle w:val="ListParagraph"/>
               <w:numPr>
                 <w:ilvl w:val="0"/>
                 <w:numId w:val="2"/>
@@ -3475,7 +4007,7 @@
           </w:p>
           <w:p>
             <w:pPr>
-              <w:pStyle w:val="Listenabsatz"/>
+              <w:pStyle w:val="ListParagraph"/>
               <w:numPr>
                 <w:ilvl w:val="0"/>
                 <w:numId w:val="2"/>
@@ -3501,7 +4033,7 @@
           </w:p>
           <w:p>
             <w:pPr>
-              <w:pStyle w:val="Listenabsatz"/>
+              <w:pStyle w:val="ListParagraph"/>
               <w:numPr>
                 <w:ilvl w:val="0"/>
                 <w:numId w:val="2"/>
@@ -3585,11 +4117,10 @@
         <w:tc>
           <w:tcPr>
             <w:tcW w:w="5221" w:type="dxa"/>
-            <w:tcMar/>
           </w:tcPr>
           <w:p>
             <w:pPr>
-              <w:pStyle w:val="Listenabsatz"/>
+              <w:pStyle w:val="ListParagraph"/>
               <w:ind w:left="0"/>
               <w:rPr>
                 <w:rFonts w:ascii="Franklin Gothic Book" w:hAnsi="Franklin Gothic Book"/>
@@ -3630,7 +4161,7 @@
           </w:p>
           <w:p>
             <w:pPr>
-              <w:pStyle w:val="Listenabsatz"/>
+              <w:pStyle w:val="ListParagraph"/>
               <w:ind w:left="0"/>
               <w:rPr>
                 <w:rFonts w:ascii="Franklin Gothic Book" w:hAnsi="Franklin Gothic Book"/>
@@ -3645,7 +4176,7 @@
           </w:p>
           <w:p>
             <w:pPr>
-              <w:pStyle w:val="Listenabsatz"/>
+              <w:pStyle w:val="ListParagraph"/>
               <w:numPr>
                 <w:ilvl w:val="0"/>
                 <w:numId w:val="3"/>
@@ -3691,15 +4222,15 @@
           </w:p>
           <w:p>
             <w:pPr>
-              <w:pStyle w:val="Listenabsatz"/>
+              <w:pStyle w:val="ListParagraph"/>
               <w:numPr>
                 <w:ilvl w:val="0"/>
                 <w:numId w:val="3"/>
               </w:numPr>
               <w:rPr>
                 <w:rFonts w:ascii="Franklin Gothic Book" w:hAnsi="Franklin Gothic Book"/>
-                <w:i w:val="1"/>
-                <w:iCs w:val="1"/>
+                <w:i/>
+                <w:iCs/>
                 <w:sz w:val="24"/>
                 <w:szCs w:val="24"/>
               </w:rPr>
@@ -3707,8 +4238,8 @@
             <w:r>
               <w:rPr>
                 <w:rFonts w:ascii="Franklin Gothic Book" w:hAnsi="Franklin Gothic Book"/>
-                <w:i w:val="1"/>
-                <w:iCs w:val="1"/>
+                <w:i/>
+                <w:iCs/>
                 <w:sz w:val="24"/>
                 <w:szCs w:val="24"/>
               </w:rPr>
@@ -3717,7 +4248,7 @@
           </w:p>
           <w:p>
             <w:pPr>
-              <w:pStyle w:val="Listenabsatz"/>
+              <w:pStyle w:val="ListParagraph"/>
               <w:numPr>
                 <w:ilvl w:val="0"/>
                 <w:numId w:val="3"/>
@@ -3743,7 +4274,7 @@
           </w:p>
           <w:p>
             <w:pPr>
-              <w:pStyle w:val="Listenabsatz"/>
+              <w:pStyle w:val="ListParagraph"/>
               <w:numPr>
                 <w:ilvl w:val="0"/>
                 <w:numId w:val="3"/>
@@ -3769,7 +4300,7 @@
           </w:p>
           <w:p>
             <w:pPr>
-              <w:pStyle w:val="Listenabsatz"/>
+              <w:pStyle w:val="ListParagraph"/>
               <w:numPr>
                 <w:ilvl w:val="0"/>
                 <w:numId w:val="3"/>
@@ -3851,7 +4382,7 @@
           </w:p>
           <w:p>
             <w:pPr>
-              <w:pStyle w:val="Listenabsatz"/>
+              <w:pStyle w:val="ListParagraph"/>
               <w:ind w:left="0"/>
               <w:rPr>
                 <w:rFonts w:ascii="Franklin Gothic Book" w:hAnsi="Franklin Gothic Book"/>
@@ -3864,18 +4395,985 @@
           </w:p>
         </w:tc>
       </w:tr>
+      <w:tr>
+        <w:trPr>
+          <w:trHeight w:val="2223"/>
+        </w:trPr>
+        <w:tc>
+          <w:tcPr>
+            <w:tcW w:w="5221" w:type="dxa"/>
+          </w:tcPr>
+          <w:p>
+            <w:pPr>
+              <w:pStyle w:val="ListParagraph"/>
+              <w:ind w:left="0"/>
+              <w:rPr>
+                <w:rFonts w:ascii="Franklin Gothic Book" w:hAnsi="Franklin Gothic Book"/>
+                <w:b/>
+                <w:bCs/>
+                <w:iCs/>
+                <w:sz w:val="24"/>
+                <w:szCs w:val="24"/>
+              </w:rPr>
+            </w:pPr>
+            <w:r>
+              <w:rPr>
+                <w:rFonts w:ascii="Franklin Gothic Book" w:hAnsi="Franklin Gothic Book"/>
+                <w:b/>
+                <w:bCs/>
+                <w:iCs/>
+                <w:sz w:val="24"/>
+                <w:szCs w:val="24"/>
+              </w:rPr>
+              <w:lastRenderedPageBreak/>
+              <w:t xml:space="preserve">9 bis 17 Uhr = 8 </w:t>
+            </w:r>
+            <w:proofErr w:type="spellStart"/>
+            <w:r>
+              <w:rPr>
+                <w:rFonts w:ascii="Franklin Gothic Book" w:hAnsi="Franklin Gothic Book"/>
+                <w:b/>
+                <w:bCs/>
+                <w:iCs/>
+                <w:sz w:val="24"/>
+                <w:szCs w:val="24"/>
+              </w:rPr>
+              <w:t>std.</w:t>
+            </w:r>
+            <w:proofErr w:type="spellEnd"/>
+            <w:r>
+              <w:rPr>
+                <w:rFonts w:ascii="Franklin Gothic Book" w:hAnsi="Franklin Gothic Book"/>
+                <w:b/>
+                <w:bCs/>
+                <w:iCs/>
+                <w:sz w:val="24"/>
+                <w:szCs w:val="24"/>
+              </w:rPr>
+              <w:br/>
+            </w:r>
+            <w:r>
+              <w:rPr>
+                <w:rFonts w:ascii="Franklin Gothic Book" w:hAnsi="Franklin Gothic Book"/>
+                <w:b/>
+                <w:bCs/>
+                <w:iCs/>
+                <w:sz w:val="24"/>
+                <w:szCs w:val="24"/>
+              </w:rPr>
+              <w:t>Jahresvertrag</w:t>
+            </w:r>
+            <w:r>
+              <w:rPr>
+                <w:rFonts w:ascii="Franklin Gothic Book" w:hAnsi="Franklin Gothic Book"/>
+                <w:b/>
+                <w:bCs/>
+                <w:iCs/>
+                <w:sz w:val="24"/>
+                <w:szCs w:val="24"/>
+              </w:rPr>
+              <w:br/>
+              <w:t>99% Mindestverfügbarkeit</w:t>
+            </w:r>
+            <w:r>
+              <w:rPr>
+                <w:rFonts w:ascii="Franklin Gothic Book" w:hAnsi="Franklin Gothic Book"/>
+                <w:b/>
+                <w:bCs/>
+                <w:iCs/>
+                <w:sz w:val="24"/>
+                <w:szCs w:val="24"/>
+              </w:rPr>
+              <w:br/>
+              <w:t>8h * 365d = 2920h</w:t>
+            </w:r>
+            <w:r>
+              <w:rPr>
+                <w:rFonts w:ascii="Franklin Gothic Book" w:hAnsi="Franklin Gothic Book"/>
+                <w:b/>
+                <w:bCs/>
+                <w:iCs/>
+                <w:sz w:val="24"/>
+                <w:szCs w:val="24"/>
+              </w:rPr>
+              <w:br/>
+            </w:r>
+            <w:r>
+              <w:rPr>
+                <w:rFonts w:ascii="Franklin Gothic Book" w:hAnsi="Franklin Gothic Book"/>
+                <w:b/>
+                <w:bCs/>
+                <w:iCs/>
+                <w:sz w:val="24"/>
+                <w:szCs w:val="24"/>
+              </w:rPr>
+              <w:t>2920h * 99% = 2890,8h min</w:t>
+            </w:r>
+            <w:r>
+              <w:rPr>
+                <w:rFonts w:ascii="Franklin Gothic Book" w:hAnsi="Franklin Gothic Book"/>
+                <w:b/>
+                <w:bCs/>
+                <w:iCs/>
+                <w:sz w:val="24"/>
+                <w:szCs w:val="24"/>
+              </w:rPr>
+              <w:t xml:space="preserve">. </w:t>
+            </w:r>
+            <w:proofErr w:type="spellStart"/>
+            <w:r>
+              <w:rPr>
+                <w:rFonts w:ascii="Franklin Gothic Book" w:hAnsi="Franklin Gothic Book"/>
+                <w:b/>
+                <w:bCs/>
+                <w:iCs/>
+                <w:sz w:val="24"/>
+                <w:szCs w:val="24"/>
+              </w:rPr>
+              <w:t>verfügbarkeit</w:t>
+            </w:r>
+            <w:proofErr w:type="spellEnd"/>
+          </w:p>
+          <w:p>
+            <w:pPr>
+              <w:pStyle w:val="ListParagraph"/>
+              <w:ind w:left="0"/>
+              <w:rPr>
+                <w:rFonts w:ascii="Franklin Gothic Book" w:hAnsi="Franklin Gothic Book"/>
+                <w:b/>
+                <w:bCs/>
+                <w:iCs/>
+                <w:sz w:val="24"/>
+                <w:szCs w:val="24"/>
+              </w:rPr>
+            </w:pPr>
+            <w:r>
+              <w:rPr>
+                <w:rFonts w:ascii="Franklin Gothic Book" w:hAnsi="Franklin Gothic Book"/>
+                <w:b/>
+                <w:bCs/>
+                <w:iCs/>
+                <w:sz w:val="24"/>
+                <w:szCs w:val="24"/>
+              </w:rPr>
+              <w:t xml:space="preserve">d.h. 29,2h </w:t>
+            </w:r>
+            <w:r>
+              <w:rPr>
+                <w:rFonts w:ascii="Franklin Gothic Book" w:hAnsi="Franklin Gothic Book"/>
+                <w:b/>
+                <w:bCs/>
+                <w:iCs/>
+                <w:sz w:val="24"/>
+                <w:szCs w:val="24"/>
+              </w:rPr>
+              <w:t>maximale erlaubte Ausfallzeit pro Jahr.</w:t>
+            </w:r>
+            <w:r>
+              <w:rPr>
+                <w:rFonts w:ascii="Franklin Gothic Book" w:hAnsi="Franklin Gothic Book"/>
+                <w:b/>
+                <w:bCs/>
+                <w:iCs/>
+                <w:sz w:val="24"/>
+                <w:szCs w:val="24"/>
+              </w:rPr>
+              <w:br/>
+              <w:t>Bisheriger Ausfall 17,</w:t>
+            </w:r>
+            <w:r>
+              <w:rPr>
+                <w:rFonts w:ascii="Franklin Gothic Book" w:hAnsi="Franklin Gothic Book"/>
+                <w:b/>
+                <w:bCs/>
+                <w:iCs/>
+                <w:sz w:val="24"/>
+                <w:szCs w:val="24"/>
+              </w:rPr>
+              <w:t>8h</w:t>
+            </w:r>
+          </w:p>
+        </w:tc>
+        <w:tc>
+          <w:tcPr>
+            <w:tcW w:w="5221" w:type="dxa"/>
+          </w:tcPr>
+          <w:p>
+            <w:pPr>
+              <w:pStyle w:val="ListParagraph"/>
+              <w:ind w:left="0"/>
+              <w:rPr>
+                <w:rFonts w:ascii="Franklin Gothic Book" w:hAnsi="Franklin Gothic Book"/>
+                <w:b/>
+                <w:bCs/>
+                <w:iCs/>
+                <w:sz w:val="24"/>
+                <w:szCs w:val="24"/>
+              </w:rPr>
+            </w:pPr>
+            <w:r>
+              <w:rPr>
+                <w:rFonts w:ascii="Franklin Gothic Book" w:hAnsi="Franklin Gothic Book"/>
+                <w:b/>
+                <w:bCs/>
+                <w:iCs/>
+                <w:sz w:val="24"/>
+                <w:szCs w:val="24"/>
+              </w:rPr>
+              <w:t>5 bis 21 Uhr = 16h</w:t>
+            </w:r>
+            <w:r>
+              <w:rPr>
+                <w:rFonts w:ascii="Franklin Gothic Book" w:hAnsi="Franklin Gothic Book"/>
+                <w:b/>
+                <w:bCs/>
+                <w:iCs/>
+                <w:sz w:val="24"/>
+                <w:szCs w:val="24"/>
+              </w:rPr>
+              <w:br/>
+              <w:t>Monatsvertrag</w:t>
+            </w:r>
+            <w:r>
+              <w:rPr>
+                <w:rFonts w:ascii="Franklin Gothic Book" w:hAnsi="Franklin Gothic Book"/>
+                <w:b/>
+                <w:bCs/>
+                <w:iCs/>
+                <w:sz w:val="24"/>
+                <w:szCs w:val="24"/>
+              </w:rPr>
+              <w:br/>
+            </w:r>
+            <w:r>
+              <w:rPr>
+                <w:rFonts w:ascii="Franklin Gothic Book" w:hAnsi="Franklin Gothic Book"/>
+                <w:b/>
+                <w:bCs/>
+                <w:iCs/>
+                <w:sz w:val="24"/>
+                <w:szCs w:val="24"/>
+              </w:rPr>
+              <w:t>99% Mindestverfügbarkeit</w:t>
+            </w:r>
+            <w:r>
+              <w:rPr>
+                <w:rFonts w:ascii="Franklin Gothic Book" w:hAnsi="Franklin Gothic Book"/>
+                <w:b/>
+                <w:bCs/>
+                <w:iCs/>
+                <w:sz w:val="24"/>
+                <w:szCs w:val="24"/>
+              </w:rPr>
+              <w:br/>
+            </w:r>
+            <w:r>
+              <w:rPr>
+                <w:rFonts w:ascii="Franklin Gothic Book" w:hAnsi="Franklin Gothic Book"/>
+                <w:b/>
+                <w:bCs/>
+                <w:iCs/>
+                <w:sz w:val="24"/>
+                <w:szCs w:val="24"/>
+              </w:rPr>
+              <w:t>16h * 30d =</w:t>
+            </w:r>
+            <w:r>
+              <w:rPr>
+                <w:rFonts w:ascii="Franklin Gothic Book" w:hAnsi="Franklin Gothic Book"/>
+                <w:b/>
+                <w:bCs/>
+                <w:iCs/>
+                <w:sz w:val="24"/>
+                <w:szCs w:val="24"/>
+              </w:rPr>
+              <w:t xml:space="preserve"> 480h</w:t>
+            </w:r>
+            <w:r>
+              <w:rPr>
+                <w:rFonts w:ascii="Franklin Gothic Book" w:hAnsi="Franklin Gothic Book"/>
+                <w:b/>
+                <w:bCs/>
+                <w:iCs/>
+                <w:sz w:val="24"/>
+                <w:szCs w:val="24"/>
+              </w:rPr>
+              <w:br/>
+              <w:t xml:space="preserve">480h * 99% = 477,6h min. </w:t>
+            </w:r>
+            <w:proofErr w:type="spellStart"/>
+            <w:r>
+              <w:rPr>
+                <w:rFonts w:ascii="Franklin Gothic Book" w:hAnsi="Franklin Gothic Book"/>
+                <w:b/>
+                <w:bCs/>
+                <w:iCs/>
+                <w:sz w:val="24"/>
+                <w:szCs w:val="24"/>
+              </w:rPr>
+              <w:t>verfügbarkeit</w:t>
+            </w:r>
+            <w:proofErr w:type="spellEnd"/>
+            <w:r>
+              <w:rPr>
+                <w:rFonts w:ascii="Franklin Gothic Book" w:hAnsi="Franklin Gothic Book"/>
+                <w:b/>
+                <w:bCs/>
+                <w:iCs/>
+                <w:sz w:val="24"/>
+                <w:szCs w:val="24"/>
+              </w:rPr>
+              <w:br/>
+            </w:r>
+            <w:proofErr w:type="spellStart"/>
+            <w:r>
+              <w:rPr>
+                <w:rFonts w:ascii="Franklin Gothic Book" w:hAnsi="Franklin Gothic Book"/>
+                <w:b/>
+                <w:bCs/>
+                <w:iCs/>
+                <w:sz w:val="24"/>
+                <w:szCs w:val="24"/>
+              </w:rPr>
+              <w:t>dh</w:t>
+            </w:r>
+            <w:proofErr w:type="spellEnd"/>
+            <w:r>
+              <w:rPr>
+                <w:rFonts w:ascii="Franklin Gothic Book" w:hAnsi="Franklin Gothic Book"/>
+                <w:b/>
+                <w:bCs/>
+                <w:iCs/>
+                <w:sz w:val="24"/>
+                <w:szCs w:val="24"/>
+              </w:rPr>
+              <w:t>. 2,4h maximal erlaubte Ausfallzeit pro Monat.</w:t>
+            </w:r>
+            <w:r>
+              <w:rPr>
+                <w:rFonts w:ascii="Franklin Gothic Book" w:hAnsi="Franklin Gothic Book"/>
+                <w:b/>
+                <w:bCs/>
+                <w:iCs/>
+                <w:sz w:val="24"/>
+                <w:szCs w:val="24"/>
+              </w:rPr>
+              <w:br/>
+            </w:r>
+            <w:r>
+              <w:rPr>
+                <w:rFonts w:ascii="Franklin Gothic Book" w:hAnsi="Franklin Gothic Book"/>
+                <w:b/>
+                <w:bCs/>
+                <w:iCs/>
+                <w:sz w:val="24"/>
+                <w:szCs w:val="24"/>
+              </w:rPr>
+              <w:br/>
+              <w:t xml:space="preserve">Bisheriger Ausfall </w:t>
+            </w:r>
+            <w:r>
+              <w:rPr>
+                <w:rFonts w:ascii="Franklin Gothic Book" w:hAnsi="Franklin Gothic Book"/>
+                <w:b/>
+                <w:bCs/>
+                <w:iCs/>
+                <w:sz w:val="24"/>
+                <w:szCs w:val="24"/>
+              </w:rPr>
+              <w:t>0,6h</w:t>
+            </w:r>
+          </w:p>
+        </w:tc>
+      </w:tr>
+      <w:tr>
+        <w:trPr>
+          <w:trHeight w:val="2397"/>
+        </w:trPr>
+        <w:tc>
+          <w:tcPr>
+            <w:tcW w:w="10442" w:type="dxa"/>
+            <w:gridSpan w:val="2"/>
+          </w:tcPr>
+          <w:p>
+            <w:pPr>
+              <w:pStyle w:val="ListParagraph"/>
+              <w:ind w:left="0"/>
+              <w:rPr>
+                <w:rFonts w:ascii="Franklin Gothic Book" w:hAnsi="Franklin Gothic Book"/>
+                <w:b/>
+                <w:bCs/>
+                <w:iCs/>
+                <w:sz w:val="24"/>
+                <w:szCs w:val="24"/>
+              </w:rPr>
+            </w:pPr>
+            <w:r>
+              <w:rPr>
+                <w:rFonts w:ascii="Franklin Gothic Book" w:hAnsi="Franklin Gothic Book"/>
+                <w:b/>
+                <w:bCs/>
+                <w:iCs/>
+                <w:sz w:val="24"/>
+                <w:szCs w:val="24"/>
+              </w:rPr>
+              <w:t>Entscheidung:</w:t>
+            </w:r>
+          </w:p>
+          <w:p>
+            <w:pPr>
+              <w:pStyle w:val="ListParagraph"/>
+              <w:numPr>
+                <w:ilvl w:val="0"/>
+                <w:numId w:val="16"/>
+              </w:numPr>
+              <w:rPr>
+                <w:rFonts w:ascii="Franklin Gothic Book" w:hAnsi="Franklin Gothic Book"/>
+                <w:b/>
+                <w:bCs/>
+                <w:iCs/>
+                <w:sz w:val="24"/>
+                <w:szCs w:val="24"/>
+              </w:rPr>
+            </w:pPr>
+            <w:proofErr w:type="spellStart"/>
+            <w:r>
+              <w:rPr>
+                <w:rFonts w:ascii="Franklin Gothic Book" w:hAnsi="Franklin Gothic Book"/>
+                <w:b/>
+                <w:bCs/>
+                <w:iCs/>
+                <w:sz w:val="24"/>
+                <w:szCs w:val="24"/>
+              </w:rPr>
+              <w:t>Kfr</w:t>
+            </w:r>
+            <w:proofErr w:type="spellEnd"/>
+            <w:r>
+              <w:rPr>
+                <w:rFonts w:ascii="Franklin Gothic Book" w:hAnsi="Franklin Gothic Book"/>
+                <w:b/>
+                <w:bCs/>
+                <w:iCs/>
+                <w:sz w:val="24"/>
+                <w:szCs w:val="24"/>
+              </w:rPr>
+              <w:t>. Kunde 8211, da die Vertragsstrafe höher ist</w:t>
+            </w:r>
+          </w:p>
+          <w:p>
+            <w:pPr>
+              <w:pStyle w:val="ListParagraph"/>
+              <w:numPr>
+                <w:ilvl w:val="0"/>
+                <w:numId w:val="16"/>
+              </w:numPr>
+              <w:rPr>
+                <w:rFonts w:ascii="Franklin Gothic Book" w:hAnsi="Franklin Gothic Book"/>
+                <w:b/>
+                <w:bCs/>
+                <w:iCs/>
+                <w:sz w:val="24"/>
+                <w:szCs w:val="24"/>
+              </w:rPr>
+            </w:pPr>
+            <w:r>
+              <w:rPr>
+                <w:rFonts w:ascii="Franklin Gothic Book" w:hAnsi="Franklin Gothic Book"/>
+                <w:b/>
+                <w:bCs/>
+                <w:iCs/>
+                <w:sz w:val="24"/>
+                <w:szCs w:val="24"/>
+              </w:rPr>
+              <w:t>Kunde 8279</w:t>
+            </w:r>
+            <w:r>
+              <w:rPr>
+                <w:rFonts w:ascii="Franklin Gothic Book" w:hAnsi="Franklin Gothic Book"/>
+                <w:b/>
+                <w:bCs/>
+                <w:iCs/>
+                <w:sz w:val="24"/>
+                <w:szCs w:val="24"/>
+              </w:rPr>
+              <w:t xml:space="preserve"> ist kurz vor dem Limit, es ist in der Praxis </w:t>
+            </w:r>
+            <w:r>
+              <w:rPr>
+                <w:rFonts w:ascii="Franklin Gothic Book" w:hAnsi="Franklin Gothic Book"/>
+                <w:b/>
+                <w:bCs/>
+                <w:iCs/>
+                <w:sz w:val="24"/>
+                <w:szCs w:val="24"/>
+              </w:rPr>
+              <w:t xml:space="preserve">leider sehr unwahrscheinlich, dass danach kein Ausfall </w:t>
+            </w:r>
+            <w:r>
+              <w:rPr>
+                <w:rFonts w:ascii="Franklin Gothic Book" w:hAnsi="Franklin Gothic Book"/>
+                <w:b/>
+                <w:bCs/>
+                <w:iCs/>
+                <w:sz w:val="24"/>
+                <w:szCs w:val="24"/>
+              </w:rPr>
+              <w:t>mehr erfolgt</w:t>
+            </w:r>
+            <w:r>
+              <w:rPr>
+                <w:rFonts w:ascii="Franklin Gothic Book" w:hAnsi="Franklin Gothic Book"/>
+                <w:b/>
+                <w:bCs/>
+                <w:iCs/>
+                <w:sz w:val="24"/>
+                <w:szCs w:val="24"/>
+              </w:rPr>
+              <w:t xml:space="preserve">. Vor allem, wenn man </w:t>
+            </w:r>
+            <w:proofErr w:type="spellStart"/>
+            <w:r>
+              <w:rPr>
+                <w:rFonts w:ascii="Franklin Gothic Book" w:hAnsi="Franklin Gothic Book"/>
+                <w:b/>
+                <w:bCs/>
+                <w:iCs/>
+                <w:sz w:val="24"/>
+                <w:szCs w:val="24"/>
+              </w:rPr>
+              <w:t>bedenktm</w:t>
+            </w:r>
+            <w:proofErr w:type="spellEnd"/>
+            <w:r>
+              <w:rPr>
+                <w:rFonts w:ascii="Franklin Gothic Book" w:hAnsi="Franklin Gothic Book"/>
+                <w:b/>
+                <w:bCs/>
+                <w:iCs/>
+                <w:sz w:val="24"/>
+                <w:szCs w:val="24"/>
+              </w:rPr>
+              <w:t xml:space="preserve"> dass wir uns erst im Januar befinden.</w:t>
+            </w:r>
+          </w:p>
+          <w:p>
+            <w:pPr>
+              <w:pStyle w:val="ListParagraph"/>
+              <w:numPr>
+                <w:ilvl w:val="0"/>
+                <w:numId w:val="16"/>
+              </w:numPr>
+              <w:rPr>
+                <w:rFonts w:ascii="Franklin Gothic Book" w:hAnsi="Franklin Gothic Book"/>
+                <w:b/>
+                <w:bCs/>
+                <w:iCs/>
+                <w:sz w:val="24"/>
+                <w:szCs w:val="24"/>
+              </w:rPr>
+            </w:pPr>
+            <w:r>
+              <w:rPr>
+                <w:rFonts w:ascii="Franklin Gothic Book" w:hAnsi="Franklin Gothic Book"/>
+                <w:b/>
+                <w:bCs/>
+                <w:iCs/>
+                <w:sz w:val="24"/>
+                <w:szCs w:val="24"/>
+              </w:rPr>
+              <w:t xml:space="preserve">Im schlimmsten Fall brauchen wir 2h pro für den Fall, dadurch </w:t>
+            </w:r>
+            <w:proofErr w:type="spellStart"/>
+            <w:r>
+              <w:rPr>
+                <w:rFonts w:ascii="Franklin Gothic Book" w:hAnsi="Franklin Gothic Book"/>
+                <w:b/>
+                <w:bCs/>
+                <w:iCs/>
+                <w:sz w:val="24"/>
+                <w:szCs w:val="24"/>
+              </w:rPr>
+              <w:t>überschreitung</w:t>
+            </w:r>
+            <w:proofErr w:type="spellEnd"/>
+            <w:r>
+              <w:rPr>
+                <w:rFonts w:ascii="Franklin Gothic Book" w:hAnsi="Franklin Gothic Book"/>
+                <w:b/>
+                <w:bCs/>
+                <w:iCs/>
+                <w:sz w:val="24"/>
+                <w:szCs w:val="24"/>
+              </w:rPr>
+              <w:t xml:space="preserve"> von</w:t>
+            </w:r>
+            <w:r>
+              <w:rPr>
+                <w:rFonts w:ascii="Franklin Gothic Book" w:hAnsi="Franklin Gothic Book"/>
+                <w:b/>
+                <w:bCs/>
+                <w:iCs/>
+                <w:sz w:val="24"/>
+                <w:szCs w:val="24"/>
+              </w:rPr>
+              <w:t xml:space="preserve"> maximal Ausfallzeit von Kunde </w:t>
+            </w:r>
+            <w:r>
+              <w:rPr>
+                <w:rFonts w:ascii="Franklin Gothic Book" w:hAnsi="Franklin Gothic Book"/>
+                <w:b/>
+                <w:bCs/>
+                <w:iCs/>
+                <w:sz w:val="24"/>
+                <w:szCs w:val="24"/>
+              </w:rPr>
+              <w:t>8211, somit erfolg</w:t>
+            </w:r>
+            <w:r>
+              <w:rPr>
+                <w:rFonts w:ascii="Franklin Gothic Book" w:hAnsi="Franklin Gothic Book"/>
+                <w:b/>
+                <w:bCs/>
+                <w:iCs/>
+                <w:sz w:val="24"/>
+                <w:szCs w:val="24"/>
+              </w:rPr>
+              <w:t>t Verlust (Vertragsstrafen) bei beiden Kunden -&gt; Kunde 8211 zuerst</w:t>
+            </w:r>
+            <w:r>
+              <w:rPr>
+                <w:rFonts w:ascii="Franklin Gothic Book" w:hAnsi="Franklin Gothic Book"/>
+                <w:b/>
+                <w:bCs/>
+                <w:iCs/>
+                <w:sz w:val="24"/>
+                <w:szCs w:val="24"/>
+              </w:rPr>
+              <w:t>, um Vertragsstrafe minimal zu halten</w:t>
+            </w:r>
+          </w:p>
+          <w:p>
+            <w:pPr>
+              <w:ind w:left="360"/>
+              <w:rPr>
+                <w:rFonts w:ascii="Franklin Gothic Book" w:hAnsi="Franklin Gothic Book"/>
+                <w:b/>
+                <w:bCs/>
+                <w:iCs/>
+                <w:sz w:val="24"/>
+                <w:szCs w:val="24"/>
+              </w:rPr>
+            </w:pPr>
+            <w:r>
+              <w:rPr>
+                <w:rFonts w:ascii="Franklin Gothic Book" w:hAnsi="Franklin Gothic Book"/>
+                <w:b/>
+                <w:bCs/>
+                <w:iCs/>
+                <w:sz w:val="24"/>
+                <w:szCs w:val="24"/>
+              </w:rPr>
+              <w:t>Weitere Gedanken:</w:t>
+            </w:r>
+          </w:p>
+          <w:p>
+            <w:pPr>
+              <w:pStyle w:val="ListParagraph"/>
+              <w:numPr>
+                <w:ilvl w:val="0"/>
+                <w:numId w:val="16"/>
+              </w:numPr>
+              <w:rPr>
+                <w:rFonts w:ascii="Franklin Gothic Book" w:hAnsi="Franklin Gothic Book"/>
+                <w:b/>
+                <w:bCs/>
+                <w:iCs/>
+                <w:sz w:val="24"/>
+                <w:szCs w:val="24"/>
+              </w:rPr>
+            </w:pPr>
+            <w:r>
+              <w:rPr>
+                <w:rFonts w:ascii="Franklin Gothic Book" w:hAnsi="Franklin Gothic Book"/>
+                <w:b/>
+                <w:bCs/>
+                <w:iCs/>
+                <w:sz w:val="24"/>
+                <w:szCs w:val="24"/>
+              </w:rPr>
+              <w:t>Welche Art von Problem liegt vor</w:t>
+            </w:r>
+          </w:p>
+          <w:p>
+            <w:pPr>
+              <w:pStyle w:val="ListParagraph"/>
+              <w:numPr>
+                <w:ilvl w:val="0"/>
+                <w:numId w:val="16"/>
+              </w:numPr>
+              <w:rPr>
+                <w:rFonts w:ascii="Franklin Gothic Book" w:hAnsi="Franklin Gothic Book"/>
+                <w:b/>
+                <w:bCs/>
+                <w:iCs/>
+                <w:sz w:val="24"/>
+                <w:szCs w:val="24"/>
+              </w:rPr>
+            </w:pPr>
+            <w:r>
+              <w:rPr>
+                <w:rFonts w:ascii="Franklin Gothic Book" w:hAnsi="Franklin Gothic Book"/>
+                <w:b/>
+                <w:bCs/>
+                <w:iCs/>
+                <w:sz w:val="24"/>
+                <w:szCs w:val="24"/>
+              </w:rPr>
+              <w:t>Qualifikation von Kollegen?</w:t>
+            </w:r>
+          </w:p>
+          <w:p>
+            <w:pPr>
+              <w:pStyle w:val="ListParagraph"/>
+              <w:numPr>
+                <w:ilvl w:val="0"/>
+                <w:numId w:val="16"/>
+              </w:numPr>
+              <w:rPr>
+                <w:rFonts w:ascii="Franklin Gothic Book" w:hAnsi="Franklin Gothic Book"/>
+                <w:b/>
+                <w:bCs/>
+                <w:iCs/>
+                <w:sz w:val="24"/>
+                <w:szCs w:val="24"/>
+              </w:rPr>
+            </w:pPr>
+            <w:r>
+              <w:rPr>
+                <w:rFonts w:ascii="Franklin Gothic Book" w:hAnsi="Franklin Gothic Book"/>
+                <w:b/>
+                <w:bCs/>
+                <w:iCs/>
+                <w:sz w:val="24"/>
+                <w:szCs w:val="24"/>
+              </w:rPr>
+              <w:t>Höhe der Vertragsstrafe (Vertragsvolumen)</w:t>
+            </w:r>
+          </w:p>
+          <w:p>
+            <w:pPr>
+              <w:pStyle w:val="ListParagraph"/>
+              <w:numPr>
+                <w:ilvl w:val="0"/>
+                <w:numId w:val="16"/>
+              </w:numPr>
+              <w:rPr>
+                <w:rFonts w:ascii="Franklin Gothic Book" w:hAnsi="Franklin Gothic Book"/>
+                <w:b/>
+                <w:bCs/>
+                <w:iCs/>
+                <w:sz w:val="24"/>
+                <w:szCs w:val="24"/>
+              </w:rPr>
+            </w:pPr>
+            <w:r>
+              <w:rPr>
+                <w:rFonts w:ascii="Franklin Gothic Book" w:hAnsi="Franklin Gothic Book"/>
+                <w:b/>
+                <w:bCs/>
+                <w:iCs/>
+                <w:sz w:val="24"/>
+                <w:szCs w:val="24"/>
+              </w:rPr>
+              <w:t>Wie viel hat der Kunde bei uns bestellt?</w:t>
+            </w:r>
+          </w:p>
+          <w:p>
+            <w:pPr>
+              <w:pStyle w:val="ListParagraph"/>
+              <w:numPr>
+                <w:ilvl w:val="0"/>
+                <w:numId w:val="16"/>
+              </w:numPr>
+              <w:rPr>
+                <w:rFonts w:ascii="Franklin Gothic Book" w:hAnsi="Franklin Gothic Book"/>
+                <w:b/>
+                <w:bCs/>
+                <w:iCs/>
+                <w:sz w:val="24"/>
+                <w:szCs w:val="24"/>
+              </w:rPr>
+            </w:pPr>
+            <w:r>
+              <w:rPr>
+                <w:rFonts w:ascii="Franklin Gothic Book" w:hAnsi="Franklin Gothic Book"/>
+                <w:b/>
+                <w:bCs/>
+                <w:iCs/>
+                <w:sz w:val="24"/>
+                <w:szCs w:val="24"/>
+              </w:rPr>
+              <w:t>Langjähriger Kunde?</w:t>
+            </w:r>
+          </w:p>
+          <w:p>
+            <w:pPr>
+              <w:pStyle w:val="ListParagraph"/>
+              <w:numPr>
+                <w:ilvl w:val="0"/>
+                <w:numId w:val="16"/>
+              </w:numPr>
+              <w:rPr>
+                <w:rFonts w:ascii="Franklin Gothic Book" w:hAnsi="Franklin Gothic Book"/>
+                <w:b/>
+                <w:bCs/>
+                <w:iCs/>
+                <w:sz w:val="24"/>
+                <w:szCs w:val="24"/>
+              </w:rPr>
+            </w:pPr>
+            <w:r>
+              <w:rPr>
+                <w:rFonts w:ascii="Franklin Gothic Book" w:hAnsi="Franklin Gothic Book"/>
+                <w:b/>
+                <w:bCs/>
+                <w:iCs/>
+                <w:sz w:val="24"/>
+                <w:szCs w:val="24"/>
+              </w:rPr>
+              <w:t>Kundenflexibilität?</w:t>
+            </w:r>
+          </w:p>
+          <w:p>
+            <w:pPr>
+              <w:pStyle w:val="ListParagraph"/>
+              <w:numPr>
+                <w:ilvl w:val="0"/>
+                <w:numId w:val="16"/>
+              </w:numPr>
+              <w:rPr>
+                <w:rFonts w:ascii="Franklin Gothic Book" w:hAnsi="Franklin Gothic Book"/>
+                <w:b/>
+                <w:bCs/>
+                <w:iCs/>
+                <w:sz w:val="24"/>
+                <w:szCs w:val="24"/>
+              </w:rPr>
+            </w:pPr>
+            <w:r>
+              <w:rPr>
+                <w:rFonts w:ascii="Franklin Gothic Book" w:hAnsi="Franklin Gothic Book"/>
+                <w:b/>
+                <w:bCs/>
+                <w:iCs/>
+                <w:sz w:val="24"/>
+                <w:szCs w:val="24"/>
+              </w:rPr>
+              <w:t xml:space="preserve">Ist beim Kunden in letzter </w:t>
+            </w:r>
+            <w:r>
+              <w:rPr>
+                <w:rFonts w:ascii="Franklin Gothic Book" w:hAnsi="Franklin Gothic Book"/>
+                <w:b/>
+                <w:bCs/>
+                <w:iCs/>
+                <w:sz w:val="24"/>
+                <w:szCs w:val="24"/>
+              </w:rPr>
+              <w:t>Zeit schon etwas vorgefallen?</w:t>
+            </w:r>
+          </w:p>
+          <w:p>
+            <w:pPr>
+              <w:pStyle w:val="ListParagraph"/>
+              <w:numPr>
+                <w:ilvl w:val="0"/>
+                <w:numId w:val="16"/>
+              </w:numPr>
+              <w:rPr>
+                <w:rFonts w:ascii="Franklin Gothic Book" w:hAnsi="Franklin Gothic Book"/>
+                <w:b/>
+                <w:bCs/>
+                <w:iCs/>
+                <w:sz w:val="24"/>
+                <w:szCs w:val="24"/>
+              </w:rPr>
+            </w:pPr>
+            <w:r>
+              <w:rPr>
+                <w:rFonts w:ascii="Franklin Gothic Book" w:hAnsi="Franklin Gothic Book"/>
+                <w:b/>
+                <w:bCs/>
+                <w:iCs/>
+                <w:sz w:val="24"/>
+                <w:szCs w:val="24"/>
+              </w:rPr>
+              <w:t>Wie formuliert der Kunde sein Anliegen?</w:t>
+            </w:r>
+          </w:p>
+          <w:p>
+            <w:pPr>
+              <w:pStyle w:val="ListParagraph"/>
+              <w:numPr>
+                <w:ilvl w:val="0"/>
+                <w:numId w:val="16"/>
+              </w:numPr>
+              <w:rPr>
+                <w:rFonts w:ascii="Franklin Gothic Book" w:hAnsi="Franklin Gothic Book"/>
+                <w:b/>
+                <w:bCs/>
+                <w:iCs/>
+                <w:sz w:val="24"/>
+                <w:szCs w:val="24"/>
+              </w:rPr>
+            </w:pPr>
+            <w:r>
+              <w:rPr>
+                <w:rFonts w:ascii="Franklin Gothic Book" w:hAnsi="Franklin Gothic Book"/>
+                <w:b/>
+                <w:bCs/>
+                <w:iCs/>
+                <w:sz w:val="24"/>
+                <w:szCs w:val="24"/>
+              </w:rPr>
+              <w:t>Problemverschulden (Kunde oder „wir“)</w:t>
+            </w:r>
+          </w:p>
+          <w:p>
+            <w:pPr>
+              <w:pStyle w:val="ListParagraph"/>
+              <w:numPr>
+                <w:ilvl w:val="0"/>
+                <w:numId w:val="16"/>
+              </w:numPr>
+              <w:rPr>
+                <w:rFonts w:ascii="Franklin Gothic Book" w:hAnsi="Franklin Gothic Book"/>
+                <w:b/>
+                <w:bCs/>
+                <w:iCs/>
+                <w:sz w:val="24"/>
+                <w:szCs w:val="24"/>
+              </w:rPr>
+            </w:pPr>
+            <w:r>
+              <w:rPr>
+                <w:rFonts w:ascii="Franklin Gothic Book" w:hAnsi="Franklin Gothic Book"/>
+                <w:b/>
+                <w:bCs/>
+                <w:iCs/>
+                <w:sz w:val="24"/>
+                <w:szCs w:val="24"/>
+              </w:rPr>
+              <w:t>Beim Kunden nach der Dringlichkeit nachfragen (Rücksprache halten)</w:t>
+            </w:r>
+          </w:p>
+        </w:tc>
+      </w:tr>
     </w:tbl>
-    <w:p>
-      <w:pPr>
-        <w:rPr>
-          <w:lang w:val="en-US"/>
-        </w:rPr>
-      </w:pPr>
-      <w:bookmarkStart w:name="_GoBack" w:id="3"/>
-      <w:bookmarkEnd w:id="3"/>
-    </w:p>
+    <w:p/>
     <w:sectPr>
-      <w:pgSz w:w="11906" w:h="16838" w:orient="portrait"/>
+      <w:pgSz w:w="11906" w:h="16838"/>
       <w:pgMar w:top="720" w:right="720" w:bottom="720" w:left="720" w:header="708" w:footer="708" w:gutter="0"/>
       <w:cols w:space="708"/>
       <w:docGrid w:linePitch="360"/>
@@ -3885,7 +5383,7 @@
 </file>
 
 <file path=word/endnotes.xml><?xml version="1.0" encoding="utf-8"?>
-<w:endnotes xmlns:wpc="http://schemas.microsoft.com/office/word/2010/wordprocessingCanvas" xmlns:cx="http://schemas.microsoft.com/office/drawing/2014/chartex" xmlns:cx1="http://schemas.microsoft.com/office/drawing/2015/9/8/chartex" xmlns:cx2="http://schemas.microsoft.com/office/drawing/2015/10/21/chartex" xmlns:cx3="http://schemas.microsoft.com/office/drawing/2016/5/9/chartex" xmlns:cx4="http://schemas.microsoft.com/office/drawing/2016/5/10/chartex" xmlns:cx5="http://schemas.microsoft.com/office/drawing/2016/5/11/chartex" xmlns:cx6="http://schemas.microsoft.com/office/drawing/2016/5/12/chartex" xmlns:cx7="http://schemas.microsoft.com/office/drawing/2016/5/13/chartex" xmlns:cx8="http://schemas.microsoft.com/office/drawing/2016/5/14/chartex" xmlns:mc="http://schemas.openxmlformats.org/markup-compatibility/2006" xmlns:aink="http://schemas.microsoft.com/office/drawing/2016/ink" xmlns:am3d="http://schemas.microsoft.com/office/drawing/2017/model3d" xmlns:o="urn:schemas-microsoft-com:office:office" xmlns:r="http://schemas.openxmlformats.org/officeDocument/2006/relationships" xmlns:m="http://schemas.openxmlformats.org/officeDocument/2006/math" xmlns:v="urn:schemas-microsoft-com:vml" xmlns:wp14="http://schemas.microsoft.com/office/word/2010/wordprocessingDrawing" xmlns:wp="http://schemas.openxmlformats.org/drawingml/2006/wordprocessingDrawing" xmlns:w10="urn:schemas-microsoft-com:office:word" xmlns:w="http://schemas.openxmlformats.org/wordprocessingml/2006/main" xmlns:w14="http://schemas.microsoft.com/office/word/2010/wordml" xmlns:w15="http://schemas.microsoft.com/office/word/2012/wordml" xmlns:w16cid="http://schemas.microsoft.com/office/word/2016/wordml/cid" xmlns:w16se="http://schemas.microsoft.com/office/word/2015/wordml/symex" xmlns:wpg="http://schemas.microsoft.com/office/word/2010/wordprocessingGroup" xmlns:wpi="http://schemas.microsoft.com/office/word/2010/wordprocessingInk" xmlns:wne="http://schemas.microsoft.com/office/word/2006/wordml" xmlns:wps="http://schemas.microsoft.com/office/word/2010/wordprocessingShape" mc:Ignorable="w14 w15 w16se w16cid wp14">
+<w:endnotes xmlns:wpc="http://schemas.microsoft.com/office/word/2010/wordprocessingCanvas" xmlns:cx="http://schemas.microsoft.com/office/drawing/2014/chartex" xmlns:cx1="http://schemas.microsoft.com/office/drawing/2015/9/8/chartex" xmlns:cx2="http://schemas.microsoft.com/office/drawing/2015/10/21/chartex" xmlns:cx3="http://schemas.microsoft.com/office/drawing/2016/5/9/chartex" xmlns:cx4="http://schemas.microsoft.com/office/drawing/2016/5/10/chartex" xmlns:cx5="http://schemas.microsoft.com/office/drawing/2016/5/11/chartex" xmlns:cx6="http://schemas.microsoft.com/office/drawing/2016/5/12/chartex" xmlns:cx7="http://schemas.microsoft.com/office/drawing/2016/5/13/chartex" xmlns:cx8="http://schemas.microsoft.com/office/drawing/2016/5/14/chartex" xmlns:mc="http://schemas.openxmlformats.org/markup-compatibility/2006" xmlns:aink="http://schemas.microsoft.com/office/drawing/2016/ink" xmlns:am3d="http://schemas.microsoft.com/office/drawing/2017/model3d" xmlns:o="urn:schemas-microsoft-com:office:office" xmlns:r="http://schemas.openxmlformats.org/officeDocument/2006/relationships" xmlns:m="http://schemas.openxmlformats.org/officeDocument/2006/math" xmlns:v="urn:schemas-microsoft-com:vml" xmlns:wp14="http://schemas.microsoft.com/office/word/2010/wordprocessingDrawing" xmlns:wp="http://schemas.openxmlformats.org/drawingml/2006/wordprocessingDrawing" xmlns:w10="urn:schemas-microsoft-com:office:word" xmlns:w="http://schemas.openxmlformats.org/wordprocessingml/2006/main" xmlns:w14="http://schemas.microsoft.com/office/word/2010/wordml" xmlns:w15="http://schemas.microsoft.com/office/word/2012/wordml" xmlns:w16cex="http://schemas.microsoft.com/office/word/2018/wordml/cex" xmlns:w16cid="http://schemas.microsoft.com/office/word/2016/wordml/cid" xmlns:w16="http://schemas.microsoft.com/office/word/2018/wordml" xmlns:w16sdtdh="http://schemas.microsoft.com/office/word/2020/wordml/sdtdatahash" xmlns:w16se="http://schemas.microsoft.com/office/word/2015/wordml/symex" xmlns:wpg="http://schemas.microsoft.com/office/word/2010/wordprocessingGroup" xmlns:wpi="http://schemas.microsoft.com/office/word/2010/wordprocessingInk" xmlns:wne="http://schemas.microsoft.com/office/word/2006/wordml" xmlns:wps="http://schemas.microsoft.com/office/word/2010/wordprocessingShape" mc:Ignorable="w14 w15 w16se w16cid w16 w16cex w16sdtdh wp14">
   <w:endnote w:type="separator" w:id="-1">
     <w:p>
       <w:pPr>
@@ -3910,7 +5408,7 @@
 </file>
 
 <file path=word/footnotes.xml><?xml version="1.0" encoding="utf-8"?>
-<w:footnotes xmlns:wpc="http://schemas.microsoft.com/office/word/2010/wordprocessingCanvas" xmlns:cx="http://schemas.microsoft.com/office/drawing/2014/chartex" xmlns:cx1="http://schemas.microsoft.com/office/drawing/2015/9/8/chartex" xmlns:cx2="http://schemas.microsoft.com/office/drawing/2015/10/21/chartex" xmlns:cx3="http://schemas.microsoft.com/office/drawing/2016/5/9/chartex" xmlns:cx4="http://schemas.microsoft.com/office/drawing/2016/5/10/chartex" xmlns:cx5="http://schemas.microsoft.com/office/drawing/2016/5/11/chartex" xmlns:cx6="http://schemas.microsoft.com/office/drawing/2016/5/12/chartex" xmlns:cx7="http://schemas.microsoft.com/office/drawing/2016/5/13/chartex" xmlns:cx8="http://schemas.microsoft.com/office/drawing/2016/5/14/chartex" xmlns:mc="http://schemas.openxmlformats.org/markup-compatibility/2006" xmlns:aink="http://schemas.microsoft.com/office/drawing/2016/ink" xmlns:am3d="http://schemas.microsoft.com/office/drawing/2017/model3d" xmlns:o="urn:schemas-microsoft-com:office:office" xmlns:r="http://schemas.openxmlformats.org/officeDocument/2006/relationships" xmlns:m="http://schemas.openxmlformats.org/officeDocument/2006/math" xmlns:v="urn:schemas-microsoft-com:vml" xmlns:wp14="http://schemas.microsoft.com/office/word/2010/wordprocessingDrawing" xmlns:wp="http://schemas.openxmlformats.org/drawingml/2006/wordprocessingDrawing" xmlns:w10="urn:schemas-microsoft-com:office:word" xmlns:w="http://schemas.openxmlformats.org/wordprocessingml/2006/main" xmlns:w14="http://schemas.microsoft.com/office/word/2010/wordml" xmlns:w15="http://schemas.microsoft.com/office/word/2012/wordml" xmlns:w16cid="http://schemas.microsoft.com/office/word/2016/wordml/cid" xmlns:w16se="http://schemas.microsoft.com/office/word/2015/wordml/symex" xmlns:wpg="http://schemas.microsoft.com/office/word/2010/wordprocessingGroup" xmlns:wpi="http://schemas.microsoft.com/office/word/2010/wordprocessingInk" xmlns:wne="http://schemas.microsoft.com/office/word/2006/wordml" xmlns:wps="http://schemas.microsoft.com/office/word/2010/wordprocessingShape" mc:Ignorable="w14 w15 w16se w16cid wp14">
+<w:footnotes xmlns:wpc="http://schemas.microsoft.com/office/word/2010/wordprocessingCanvas" xmlns:cx="http://schemas.microsoft.com/office/drawing/2014/chartex" xmlns:cx1="http://schemas.microsoft.com/office/drawing/2015/9/8/chartex" xmlns:cx2="http://schemas.microsoft.com/office/drawing/2015/10/21/chartex" xmlns:cx3="http://schemas.microsoft.com/office/drawing/2016/5/9/chartex" xmlns:cx4="http://schemas.microsoft.com/office/drawing/2016/5/10/chartex" xmlns:cx5="http://schemas.microsoft.com/office/drawing/2016/5/11/chartex" xmlns:cx6="http://schemas.microsoft.com/office/drawing/2016/5/12/chartex" xmlns:cx7="http://schemas.microsoft.com/office/drawing/2016/5/13/chartex" xmlns:cx8="http://schemas.microsoft.com/office/drawing/2016/5/14/chartex" xmlns:mc="http://schemas.openxmlformats.org/markup-compatibility/2006" xmlns:aink="http://schemas.microsoft.com/office/drawing/2016/ink" xmlns:am3d="http://schemas.microsoft.com/office/drawing/2017/model3d" xmlns:o="urn:schemas-microsoft-com:office:office" xmlns:r="http://schemas.openxmlformats.org/officeDocument/2006/relationships" xmlns:m="http://schemas.openxmlformats.org/officeDocument/2006/math" xmlns:v="urn:schemas-microsoft-com:vml" xmlns:wp14="http://schemas.microsoft.com/office/word/2010/wordprocessingDrawing" xmlns:wp="http://schemas.openxmlformats.org/drawingml/2006/wordprocessingDrawing" xmlns:w10="urn:schemas-microsoft-com:office:word" xmlns:w="http://schemas.openxmlformats.org/wordprocessingml/2006/main" xmlns:w14="http://schemas.microsoft.com/office/word/2010/wordml" xmlns:w15="http://schemas.microsoft.com/office/word/2012/wordml" xmlns:w16cex="http://schemas.microsoft.com/office/word/2018/wordml/cex" xmlns:w16cid="http://schemas.microsoft.com/office/word/2016/wordml/cid" xmlns:w16="http://schemas.microsoft.com/office/word/2018/wordml" xmlns:w16sdtdh="http://schemas.microsoft.com/office/word/2020/wordml/sdtdatahash" xmlns:w16se="http://schemas.microsoft.com/office/word/2015/wordml/symex" xmlns:wpg="http://schemas.microsoft.com/office/word/2010/wordprocessingGroup" xmlns:wpi="http://schemas.microsoft.com/office/word/2010/wordprocessingInk" xmlns:wne="http://schemas.microsoft.com/office/word/2006/wordml" xmlns:wps="http://schemas.microsoft.com/office/word/2010/wordprocessingShape" mc:Ignorable="w14 w15 w16se w16cid w16 w16cex w16sdtdh wp14">
   <w:footnote w:type="separator" w:id="-1">
     <w:p>
       <w:pPr>
@@ -3935,18 +5433,18 @@
 </file>
 
 <file path=word/header1.xml><?xml version="1.0" encoding="utf-8"?>
-<w:hdr xmlns:wpc="http://schemas.microsoft.com/office/word/2010/wordprocessingCanvas" xmlns:cx="http://schemas.microsoft.com/office/drawing/2014/chartex" xmlns:cx1="http://schemas.microsoft.com/office/drawing/2015/9/8/chartex" xmlns:cx2="http://schemas.microsoft.com/office/drawing/2015/10/21/chartex" xmlns:cx3="http://schemas.microsoft.com/office/drawing/2016/5/9/chartex" xmlns:cx4="http://schemas.microsoft.com/office/drawing/2016/5/10/chartex" xmlns:cx5="http://schemas.microsoft.com/office/drawing/2016/5/11/chartex" xmlns:cx6="http://schemas.microsoft.com/office/drawing/2016/5/12/chartex" xmlns:cx7="http://schemas.microsoft.com/office/drawing/2016/5/13/chartex" xmlns:cx8="http://schemas.microsoft.com/office/drawing/2016/5/14/chartex" xmlns:mc="http://schemas.openxmlformats.org/markup-compatibility/2006" xmlns:aink="http://schemas.microsoft.com/office/drawing/2016/ink" xmlns:am3d="http://schemas.microsoft.com/office/drawing/2017/model3d" xmlns:o="urn:schemas-microsoft-com:office:office" xmlns:r="http://schemas.openxmlformats.org/officeDocument/2006/relationships" xmlns:m="http://schemas.openxmlformats.org/officeDocument/2006/math" xmlns:v="urn:schemas-microsoft-com:vml" xmlns:wp14="http://schemas.microsoft.com/office/word/2010/wordprocessingDrawing" xmlns:wp="http://schemas.openxmlformats.org/drawingml/2006/wordprocessingDrawing" xmlns:w10="urn:schemas-microsoft-com:office:word" xmlns:w="http://schemas.openxmlformats.org/wordprocessingml/2006/main" xmlns:w14="http://schemas.microsoft.com/office/word/2010/wordml" xmlns:w15="http://schemas.microsoft.com/office/word/2012/wordml" xmlns:w16cid="http://schemas.microsoft.com/office/word/2016/wordml/cid" xmlns:w16se="http://schemas.microsoft.com/office/word/2015/wordml/symex" xmlns:wpg="http://schemas.microsoft.com/office/word/2010/wordprocessingGroup" xmlns:wpi="http://schemas.microsoft.com/office/word/2010/wordprocessingInk" xmlns:wne="http://schemas.microsoft.com/office/word/2006/wordml" xmlns:wps="http://schemas.microsoft.com/office/word/2010/wordprocessingShape" xmlns:a="http://schemas.openxmlformats.org/drawingml/2006/main" xmlns:pic="http://schemas.openxmlformats.org/drawingml/2006/picture" xmlns:a14="http://schemas.microsoft.com/office/drawing/2010/main" mc:Ignorable="w14 w15 w16se w16cid wp14">
+<w:hdr xmlns:wpc="http://schemas.microsoft.com/office/word/2010/wordprocessingCanvas" xmlns:cx="http://schemas.microsoft.com/office/drawing/2014/chartex" xmlns:cx1="http://schemas.microsoft.com/office/drawing/2015/9/8/chartex" xmlns:cx2="http://schemas.microsoft.com/office/drawing/2015/10/21/chartex" xmlns:cx3="http://schemas.microsoft.com/office/drawing/2016/5/9/chartex" xmlns:cx4="http://schemas.microsoft.com/office/drawing/2016/5/10/chartex" xmlns:cx5="http://schemas.microsoft.com/office/drawing/2016/5/11/chartex" xmlns:cx6="http://schemas.microsoft.com/office/drawing/2016/5/12/chartex" xmlns:cx7="http://schemas.microsoft.com/office/drawing/2016/5/13/chartex" xmlns:cx8="http://schemas.microsoft.com/office/drawing/2016/5/14/chartex" xmlns:mc="http://schemas.openxmlformats.org/markup-compatibility/2006" xmlns:aink="http://schemas.microsoft.com/office/drawing/2016/ink" xmlns:am3d="http://schemas.microsoft.com/office/drawing/2017/model3d" xmlns:o="urn:schemas-microsoft-com:office:office" xmlns:r="http://schemas.openxmlformats.org/officeDocument/2006/relationships" xmlns:m="http://schemas.openxmlformats.org/officeDocument/2006/math" xmlns:v="urn:schemas-microsoft-com:vml" xmlns:wp14="http://schemas.microsoft.com/office/word/2010/wordprocessingDrawing" xmlns:wp="http://schemas.openxmlformats.org/drawingml/2006/wordprocessingDrawing" xmlns:w10="urn:schemas-microsoft-com:office:word" xmlns:w="http://schemas.openxmlformats.org/wordprocessingml/2006/main" xmlns:w14="http://schemas.microsoft.com/office/word/2010/wordml" xmlns:w15="http://schemas.microsoft.com/office/word/2012/wordml" xmlns:w16cex="http://schemas.microsoft.com/office/word/2018/wordml/cex" xmlns:w16cid="http://schemas.microsoft.com/office/word/2016/wordml/cid" xmlns:w16="http://schemas.microsoft.com/office/word/2018/wordml" xmlns:w16sdtdh="http://schemas.microsoft.com/office/word/2020/wordml/sdtdatahash" xmlns:w16se="http://schemas.microsoft.com/office/word/2015/wordml/symex" xmlns:wpg="http://schemas.microsoft.com/office/word/2010/wordprocessingGroup" xmlns:wpi="http://schemas.microsoft.com/office/word/2010/wordprocessingInk" xmlns:wne="http://schemas.microsoft.com/office/word/2006/wordml" xmlns:wps="http://schemas.microsoft.com/office/word/2010/wordprocessingShape" mc:Ignorable="w14 w15 w16se w16cid w16 w16cex w16sdtdh wp14">
   <w:tbl>
     <w:tblPr>
       <w:tblW w:w="10540" w:type="dxa"/>
       <w:tblInd w:w="-34" w:type="dxa"/>
       <w:tblBorders>
-        <w:top w:val="single" w:color="auto" w:sz="4" w:space="0"/>
-        <w:left w:val="single" w:color="auto" w:sz="4" w:space="0"/>
-        <w:bottom w:val="single" w:color="auto" w:sz="4" w:space="0"/>
-        <w:right w:val="single" w:color="auto" w:sz="4" w:space="0"/>
-        <w:insideH w:val="single" w:color="auto" w:sz="4" w:space="0"/>
-        <w:insideV w:val="single" w:color="auto" w:sz="4" w:space="0"/>
+        <w:top w:val="single" w:sz="4" w:space="0" w:color="auto"/>
+        <w:left w:val="single" w:sz="4" w:space="0" w:color="auto"/>
+        <w:bottom w:val="single" w:sz="4" w:space="0" w:color="auto"/>
+        <w:right w:val="single" w:sz="4" w:space="0" w:color="auto"/>
+        <w:insideH w:val="single" w:sz="4" w:space="0" w:color="auto"/>
+        <w:insideV w:val="single" w:sz="4" w:space="0" w:color="auto"/>
       </w:tblBorders>
       <w:tblLayout w:type="fixed"/>
       <w:tblLook w:val="01E0" w:firstRow="1" w:lastRow="1" w:firstColumn="1" w:lastColumn="1" w:noHBand="0" w:noVBand="0"/>
@@ -3963,19 +5461,19 @@
         <w:tcPr>
           <w:tcW w:w="8974" w:type="dxa"/>
           <w:tcBorders>
-            <w:bottom w:val="single" w:color="auto" w:sz="4" w:space="0"/>
+            <w:bottom w:val="single" w:sz="4" w:space="0" w:color="auto"/>
           </w:tcBorders>
           <w:vAlign w:val="center"/>
         </w:tcPr>
         <w:p>
           <w:pPr>
-            <w:pStyle w:val="Kopfzeile"/>
+            <w:pStyle w:val="Header"/>
             <w:ind w:left="-108" w:firstLine="108"/>
             <w:rPr>
               <w:rFonts w:ascii="Franklin Gothic Book" w:hAnsi="Franklin Gothic Book" w:cs="Arial"/>
             </w:rPr>
           </w:pPr>
-          <w:bookmarkStart w:name="_Hlk85301891" w:id="0"/>
+          <w:bookmarkStart w:id="0" w:name="_Hlk85301891"/>
           <w:r>
             <w:rPr>
               <w:rFonts w:ascii="Franklin Gothic Book" w:hAnsi="Franklin Gothic Book" w:cs="Arial"/>
@@ -4018,31 +5516,23 @@
             </w:rPr>
             <w:t xml:space="preserve"> – Lernfeld 6                  </w:t>
           </w:r>
-          <w:proofErr w:type="gramStart"/>
           <w:r>
             <w:rPr>
               <w:rFonts w:ascii="Franklin Gothic Book" w:hAnsi="Franklin Gothic Book" w:cs="Arial"/>
             </w:rPr>
-            <w:t>Datum:_</w:t>
-          </w:r>
-          <w:proofErr w:type="gramEnd"/>
-          <w:r>
-            <w:rPr>
-              <w:rFonts w:ascii="Franklin Gothic Book" w:hAnsi="Franklin Gothic Book" w:cs="Arial"/>
-            </w:rPr>
-            <w:t xml:space="preserve">_______________ </w:t>
+            <w:t xml:space="preserve">Datum:________________ </w:t>
           </w:r>
         </w:p>
         <w:p>
           <w:pPr>
-            <w:pStyle w:val="Kopfzeile"/>
+            <w:pStyle w:val="Header"/>
             <w:jc w:val="center"/>
             <w:rPr>
               <w:rFonts w:ascii="Franklin Gothic Book" w:hAnsi="Franklin Gothic Book" w:cs="Arial"/>
             </w:rPr>
           </w:pPr>
-          <w:bookmarkStart w:name="_Hlk85301719" w:id="1"/>
-          <w:bookmarkStart w:name="_Hlk85301720" w:id="2"/>
+          <w:bookmarkStart w:id="1" w:name="_Hlk85301719"/>
+          <w:bookmarkStart w:id="2" w:name="_Hlk85301720"/>
           <w:r>
             <w:rPr>
               <w:rFonts w:ascii="Franklin Gothic Book" w:hAnsi="Franklin Gothic Book" w:cs="Arial"/>
@@ -4072,7 +5562,7 @@
         </w:p>
         <w:p>
           <w:pPr>
-            <w:pStyle w:val="Kopfzeile"/>
+            <w:pStyle w:val="Header"/>
             <w:rPr>
               <w:rFonts w:ascii="Franklin Gothic Book" w:hAnsi="Franklin Gothic Book" w:cs="Arial"/>
             </w:rPr>
@@ -4089,7 +5579,7 @@
         <w:tcPr>
           <w:tcW w:w="1566" w:type="dxa"/>
           <w:tcBorders>
-            <w:bottom w:val="single" w:color="auto" w:sz="4" w:space="0"/>
+            <w:bottom w:val="single" w:sz="4" w:space="0" w:color="auto"/>
           </w:tcBorders>
         </w:tcPr>
         <w:p>
@@ -4192,14 +5682,14 @@
   </w:tbl>
   <w:p>
     <w:pPr>
-      <w:pStyle w:val="Kopfzeile"/>
+      <w:pStyle w:val="Header"/>
     </w:pPr>
   </w:p>
 </w:hdr>
 </file>
 
 <file path=word/numbering.xml><?xml version="1.0" encoding="utf-8"?>
-<w:numbering xmlns:wpc="http://schemas.microsoft.com/office/word/2010/wordprocessingCanvas" xmlns:cx="http://schemas.microsoft.com/office/drawing/2014/chartex" xmlns:cx1="http://schemas.microsoft.com/office/drawing/2015/9/8/chartex" xmlns:cx2="http://schemas.microsoft.com/office/drawing/2015/10/21/chartex" xmlns:cx3="http://schemas.microsoft.com/office/drawing/2016/5/9/chartex" xmlns:cx4="http://schemas.microsoft.com/office/drawing/2016/5/10/chartex" xmlns:cx5="http://schemas.microsoft.com/office/drawing/2016/5/11/chartex" xmlns:cx6="http://schemas.microsoft.com/office/drawing/2016/5/12/chartex" xmlns:cx7="http://schemas.microsoft.com/office/drawing/2016/5/13/chartex" xmlns:cx8="http://schemas.microsoft.com/office/drawing/2016/5/14/chartex" xmlns:mc="http://schemas.openxmlformats.org/markup-compatibility/2006" xmlns:aink="http://schemas.microsoft.com/office/drawing/2016/ink" xmlns:am3d="http://schemas.microsoft.com/office/drawing/2017/model3d" xmlns:o="urn:schemas-microsoft-com:office:office" xmlns:r="http://schemas.openxmlformats.org/officeDocument/2006/relationships" xmlns:m="http://schemas.openxmlformats.org/officeDocument/2006/math" xmlns:v="urn:schemas-microsoft-com:vml" xmlns:wp14="http://schemas.microsoft.com/office/word/2010/wordprocessingDrawing" xmlns:wp="http://schemas.openxmlformats.org/drawingml/2006/wordprocessingDrawing" xmlns:w10="urn:schemas-microsoft-com:office:word" xmlns:w="http://schemas.openxmlformats.org/wordprocessingml/2006/main" xmlns:w14="http://schemas.microsoft.com/office/word/2010/wordml" xmlns:w15="http://schemas.microsoft.com/office/word/2012/wordml" xmlns:w16cid="http://schemas.microsoft.com/office/word/2016/wordml/cid" xmlns:w16se="http://schemas.microsoft.com/office/word/2015/wordml/symex" xmlns:wpg="http://schemas.microsoft.com/office/word/2010/wordprocessingGroup" xmlns:wpi="http://schemas.microsoft.com/office/word/2010/wordprocessingInk" xmlns:wne="http://schemas.microsoft.com/office/word/2006/wordml" xmlns:wps="http://schemas.microsoft.com/office/word/2010/wordprocessingShape" mc:Ignorable="w14 w15 w16se w16cid wp14">
+<w:numbering xmlns:wpc="http://schemas.microsoft.com/office/word/2010/wordprocessingCanvas" xmlns:cx="http://schemas.microsoft.com/office/drawing/2014/chartex" xmlns:cx1="http://schemas.microsoft.com/office/drawing/2015/9/8/chartex" xmlns:cx2="http://schemas.microsoft.com/office/drawing/2015/10/21/chartex" xmlns:cx3="http://schemas.microsoft.com/office/drawing/2016/5/9/chartex" xmlns:cx4="http://schemas.microsoft.com/office/drawing/2016/5/10/chartex" xmlns:cx5="http://schemas.microsoft.com/office/drawing/2016/5/11/chartex" xmlns:cx6="http://schemas.microsoft.com/office/drawing/2016/5/12/chartex" xmlns:cx7="http://schemas.microsoft.com/office/drawing/2016/5/13/chartex" xmlns:cx8="http://schemas.microsoft.com/office/drawing/2016/5/14/chartex" xmlns:mc="http://schemas.openxmlformats.org/markup-compatibility/2006" xmlns:aink="http://schemas.microsoft.com/office/drawing/2016/ink" xmlns:am3d="http://schemas.microsoft.com/office/drawing/2017/model3d" xmlns:o="urn:schemas-microsoft-com:office:office" xmlns:r="http://schemas.openxmlformats.org/officeDocument/2006/relationships" xmlns:m="http://schemas.openxmlformats.org/officeDocument/2006/math" xmlns:v="urn:schemas-microsoft-com:vml" xmlns:wp14="http://schemas.microsoft.com/office/word/2010/wordprocessingDrawing" xmlns:wp="http://schemas.openxmlformats.org/drawingml/2006/wordprocessingDrawing" xmlns:w10="urn:schemas-microsoft-com:office:word" xmlns:w="http://schemas.openxmlformats.org/wordprocessingml/2006/main" xmlns:w14="http://schemas.microsoft.com/office/word/2010/wordml" xmlns:w15="http://schemas.microsoft.com/office/word/2012/wordml" xmlns:w16cex="http://schemas.microsoft.com/office/word/2018/wordml/cex" xmlns:w16cid="http://schemas.microsoft.com/office/word/2016/wordml/cid" xmlns:w16="http://schemas.microsoft.com/office/word/2018/wordml" xmlns:w16sdtdh="http://schemas.microsoft.com/office/word/2020/wordml/sdtdatahash" xmlns:w16se="http://schemas.microsoft.com/office/word/2015/wordml/symex" xmlns:wpg="http://schemas.microsoft.com/office/word/2010/wordprocessingGroup" xmlns:wpi="http://schemas.microsoft.com/office/word/2010/wordprocessingInk" xmlns:wne="http://schemas.microsoft.com/office/word/2006/wordml" xmlns:wps="http://schemas.microsoft.com/office/word/2010/wordprocessingShape" mc:Ignorable="w14 w15 w16se w16cid w16 w16cex w16sdtdh wp14">
   <w:abstractNum w:abstractNumId="0" w15:restartNumberingAfterBreak="0">
     <w:nsid w:val="00002CA7"/>
     <w:multiLevelType w:val="hybridMultilevel"/>
@@ -4569,7 +6059,7 @@
         <w:ind w:left="720" w:hanging="360"/>
       </w:pPr>
       <w:rPr>
-        <w:rFonts w:hint="default" w:ascii="Wingdings" w:hAnsi="Wingdings" w:eastAsiaTheme="minorHAnsi" w:cstheme="minorBidi"/>
+        <w:rFonts w:ascii="Wingdings" w:eastAsiaTheme="minorHAnsi" w:hAnsi="Wingdings" w:cstheme="minorBidi" w:hint="default"/>
       </w:rPr>
     </w:lvl>
     <w:lvl w:ilvl="1" w:tplc="04070003" w:tentative="1">
@@ -4581,7 +6071,7 @@
         <w:ind w:left="1440" w:hanging="360"/>
       </w:pPr>
       <w:rPr>
-        <w:rFonts w:hint="default" w:ascii="Courier New" w:hAnsi="Courier New" w:cs="Courier New"/>
+        <w:rFonts w:ascii="Courier New" w:hAnsi="Courier New" w:cs="Courier New" w:hint="default"/>
       </w:rPr>
     </w:lvl>
     <w:lvl w:ilvl="2" w:tplc="04070005" w:tentative="1">
@@ -4593,7 +6083,7 @@
         <w:ind w:left="2160" w:hanging="360"/>
       </w:pPr>
       <w:rPr>
-        <w:rFonts w:hint="default" w:ascii="Wingdings" w:hAnsi="Wingdings"/>
+        <w:rFonts w:ascii="Wingdings" w:hAnsi="Wingdings" w:hint="default"/>
       </w:rPr>
     </w:lvl>
     <w:lvl w:ilvl="3" w:tplc="04070001" w:tentative="1">
@@ -4605,7 +6095,7 @@
         <w:ind w:left="2880" w:hanging="360"/>
       </w:pPr>
       <w:rPr>
-        <w:rFonts w:hint="default" w:ascii="Symbol" w:hAnsi="Symbol"/>
+        <w:rFonts w:ascii="Symbol" w:hAnsi="Symbol" w:hint="default"/>
       </w:rPr>
     </w:lvl>
     <w:lvl w:ilvl="4" w:tplc="04070003" w:tentative="1">
@@ -4617,7 +6107,7 @@
         <w:ind w:left="3600" w:hanging="360"/>
       </w:pPr>
       <w:rPr>
-        <w:rFonts w:hint="default" w:ascii="Courier New" w:hAnsi="Courier New" w:cs="Courier New"/>
+        <w:rFonts w:ascii="Courier New" w:hAnsi="Courier New" w:cs="Courier New" w:hint="default"/>
       </w:rPr>
     </w:lvl>
     <w:lvl w:ilvl="5" w:tplc="04070005" w:tentative="1">
@@ -4629,7 +6119,7 @@
         <w:ind w:left="4320" w:hanging="360"/>
       </w:pPr>
       <w:rPr>
-        <w:rFonts w:hint="default" w:ascii="Wingdings" w:hAnsi="Wingdings"/>
+        <w:rFonts w:ascii="Wingdings" w:hAnsi="Wingdings" w:hint="default"/>
       </w:rPr>
     </w:lvl>
     <w:lvl w:ilvl="6" w:tplc="04070001" w:tentative="1">
@@ -4641,7 +6131,7 @@
         <w:ind w:left="5040" w:hanging="360"/>
       </w:pPr>
       <w:rPr>
-        <w:rFonts w:hint="default" w:ascii="Symbol" w:hAnsi="Symbol"/>
+        <w:rFonts w:ascii="Symbol" w:hAnsi="Symbol" w:hint="default"/>
       </w:rPr>
     </w:lvl>
     <w:lvl w:ilvl="7" w:tplc="04070003" w:tentative="1">
@@ -4653,7 +6143,7 @@
         <w:ind w:left="5760" w:hanging="360"/>
       </w:pPr>
       <w:rPr>
-        <w:rFonts w:hint="default" w:ascii="Courier New" w:hAnsi="Courier New" w:cs="Courier New"/>
+        <w:rFonts w:ascii="Courier New" w:hAnsi="Courier New" w:cs="Courier New" w:hint="default"/>
       </w:rPr>
     </w:lvl>
     <w:lvl w:ilvl="8" w:tplc="04070005" w:tentative="1">
@@ -4665,7 +6155,7 @@
         <w:ind w:left="6480" w:hanging="360"/>
       </w:pPr>
       <w:rPr>
-        <w:rFonts w:hint="default" w:ascii="Wingdings" w:hAnsi="Wingdings"/>
+        <w:rFonts w:ascii="Wingdings" w:hAnsi="Wingdings" w:hint="default"/>
       </w:rPr>
     </w:lvl>
   </w:abstractNum>
@@ -4884,7 +6374,7 @@
         <w:ind w:left="720" w:hanging="360"/>
       </w:pPr>
       <w:rPr>
-        <w:rFonts w:hint="default" w:ascii="Symbol" w:hAnsi="Symbol"/>
+        <w:rFonts w:ascii="Symbol" w:hAnsi="Symbol" w:hint="default"/>
       </w:rPr>
     </w:lvl>
     <w:lvl w:ilvl="1" w:tplc="04070003" w:tentative="1">
@@ -4896,7 +6386,7 @@
         <w:ind w:left="1440" w:hanging="360"/>
       </w:pPr>
       <w:rPr>
-        <w:rFonts w:hint="default" w:ascii="Courier New" w:hAnsi="Courier New" w:cs="Courier New"/>
+        <w:rFonts w:ascii="Courier New" w:hAnsi="Courier New" w:cs="Courier New" w:hint="default"/>
       </w:rPr>
     </w:lvl>
     <w:lvl w:ilvl="2" w:tplc="04070005" w:tentative="1">
@@ -4908,7 +6398,7 @@
         <w:ind w:left="2160" w:hanging="360"/>
       </w:pPr>
       <w:rPr>
-        <w:rFonts w:hint="default" w:ascii="Wingdings" w:hAnsi="Wingdings"/>
+        <w:rFonts w:ascii="Wingdings" w:hAnsi="Wingdings" w:hint="default"/>
       </w:rPr>
     </w:lvl>
     <w:lvl w:ilvl="3" w:tplc="04070001" w:tentative="1">
@@ -4920,7 +6410,7 @@
         <w:ind w:left="2880" w:hanging="360"/>
       </w:pPr>
       <w:rPr>
-        <w:rFonts w:hint="default" w:ascii="Symbol" w:hAnsi="Symbol"/>
+        <w:rFonts w:ascii="Symbol" w:hAnsi="Symbol" w:hint="default"/>
       </w:rPr>
     </w:lvl>
     <w:lvl w:ilvl="4" w:tplc="04070003" w:tentative="1">
@@ -4932,7 +6422,7 @@
         <w:ind w:left="3600" w:hanging="360"/>
       </w:pPr>
       <w:rPr>
-        <w:rFonts w:hint="default" w:ascii="Courier New" w:hAnsi="Courier New" w:cs="Courier New"/>
+        <w:rFonts w:ascii="Courier New" w:hAnsi="Courier New" w:cs="Courier New" w:hint="default"/>
       </w:rPr>
     </w:lvl>
     <w:lvl w:ilvl="5" w:tplc="04070005" w:tentative="1">
@@ -4944,7 +6434,7 @@
         <w:ind w:left="4320" w:hanging="360"/>
       </w:pPr>
       <w:rPr>
-        <w:rFonts w:hint="default" w:ascii="Wingdings" w:hAnsi="Wingdings"/>
+        <w:rFonts w:ascii="Wingdings" w:hAnsi="Wingdings" w:hint="default"/>
       </w:rPr>
     </w:lvl>
     <w:lvl w:ilvl="6" w:tplc="04070001" w:tentative="1">
@@ -4956,7 +6446,7 @@
         <w:ind w:left="5040" w:hanging="360"/>
       </w:pPr>
       <w:rPr>
-        <w:rFonts w:hint="default" w:ascii="Symbol" w:hAnsi="Symbol"/>
+        <w:rFonts w:ascii="Symbol" w:hAnsi="Symbol" w:hint="default"/>
       </w:rPr>
     </w:lvl>
     <w:lvl w:ilvl="7" w:tplc="04070003" w:tentative="1">
@@ -4968,7 +6458,7 @@
         <w:ind w:left="5760" w:hanging="360"/>
       </w:pPr>
       <w:rPr>
-        <w:rFonts w:hint="default" w:ascii="Courier New" w:hAnsi="Courier New" w:cs="Courier New"/>
+        <w:rFonts w:ascii="Courier New" w:hAnsi="Courier New" w:cs="Courier New" w:hint="default"/>
       </w:rPr>
     </w:lvl>
     <w:lvl w:ilvl="8" w:tplc="04070005" w:tentative="1">
@@ -4980,7 +6470,7 @@
         <w:ind w:left="6480" w:hanging="360"/>
       </w:pPr>
       <w:rPr>
-        <w:rFonts w:hint="default" w:ascii="Wingdings" w:hAnsi="Wingdings"/>
+        <w:rFonts w:ascii="Wingdings" w:hAnsi="Wingdings" w:hint="default"/>
       </w:rPr>
     </w:lvl>
   </w:abstractNum>
@@ -5164,6 +6654,119 @@
     </w:lvl>
   </w:abstractNum>
   <w:abstractNum w:abstractNumId="10" w15:restartNumberingAfterBreak="0">
+    <w:nsid w:val="4B5B338D"/>
+    <w:multiLevelType w:val="hybridMultilevel"/>
+    <w:tmpl w:val="C2DE52B6"/>
+    <w:lvl w:ilvl="0" w:tplc="ABBE4D74">
+      <w:start w:val="5"/>
+      <w:numFmt w:val="bullet"/>
+      <w:lvlText w:val="-"/>
+      <w:lvlJc w:val="left"/>
+      <w:pPr>
+        <w:ind w:left="720" w:hanging="360"/>
+      </w:pPr>
+      <w:rPr>
+        <w:rFonts w:ascii="Franklin Gothic Book" w:eastAsiaTheme="minorHAnsi" w:hAnsi="Franklin Gothic Book" w:cstheme="minorBidi" w:hint="default"/>
+      </w:rPr>
+    </w:lvl>
+    <w:lvl w:ilvl="1" w:tplc="04070003" w:tentative="1">
+      <w:start w:val="1"/>
+      <w:numFmt w:val="bullet"/>
+      <w:lvlText w:val="o"/>
+      <w:lvlJc w:val="left"/>
+      <w:pPr>
+        <w:ind w:left="1440" w:hanging="360"/>
+      </w:pPr>
+      <w:rPr>
+        <w:rFonts w:ascii="Courier New" w:hAnsi="Courier New" w:cs="Courier New" w:hint="default"/>
+      </w:rPr>
+    </w:lvl>
+    <w:lvl w:ilvl="2" w:tplc="04070005" w:tentative="1">
+      <w:start w:val="1"/>
+      <w:numFmt w:val="bullet"/>
+      <w:lvlText w:val=""/>
+      <w:lvlJc w:val="left"/>
+      <w:pPr>
+        <w:ind w:left="2160" w:hanging="360"/>
+      </w:pPr>
+      <w:rPr>
+        <w:rFonts w:ascii="Wingdings" w:hAnsi="Wingdings" w:hint="default"/>
+      </w:rPr>
+    </w:lvl>
+    <w:lvl w:ilvl="3" w:tplc="04070001" w:tentative="1">
+      <w:start w:val="1"/>
+      <w:numFmt w:val="bullet"/>
+      <w:lvlText w:val=""/>
+      <w:lvlJc w:val="left"/>
+      <w:pPr>
+        <w:ind w:left="2880" w:hanging="360"/>
+      </w:pPr>
+      <w:rPr>
+        <w:rFonts w:ascii="Symbol" w:hAnsi="Symbol" w:hint="default"/>
+      </w:rPr>
+    </w:lvl>
+    <w:lvl w:ilvl="4" w:tplc="04070003" w:tentative="1">
+      <w:start w:val="1"/>
+      <w:numFmt w:val="bullet"/>
+      <w:lvlText w:val="o"/>
+      <w:lvlJc w:val="left"/>
+      <w:pPr>
+        <w:ind w:left="3600" w:hanging="360"/>
+      </w:pPr>
+      <w:rPr>
+        <w:rFonts w:ascii="Courier New" w:hAnsi="Courier New" w:cs="Courier New" w:hint="default"/>
+      </w:rPr>
+    </w:lvl>
+    <w:lvl w:ilvl="5" w:tplc="04070005" w:tentative="1">
+      <w:start w:val="1"/>
+      <w:numFmt w:val="bullet"/>
+      <w:lvlText w:val=""/>
+      <w:lvlJc w:val="left"/>
+      <w:pPr>
+        <w:ind w:left="4320" w:hanging="360"/>
+      </w:pPr>
+      <w:rPr>
+        <w:rFonts w:ascii="Wingdings" w:hAnsi="Wingdings" w:hint="default"/>
+      </w:rPr>
+    </w:lvl>
+    <w:lvl w:ilvl="6" w:tplc="04070001" w:tentative="1">
+      <w:start w:val="1"/>
+      <w:numFmt w:val="bullet"/>
+      <w:lvlText w:val=""/>
+      <w:lvlJc w:val="left"/>
+      <w:pPr>
+        <w:ind w:left="5040" w:hanging="360"/>
+      </w:pPr>
+      <w:rPr>
+        <w:rFonts w:ascii="Symbol" w:hAnsi="Symbol" w:hint="default"/>
+      </w:rPr>
+    </w:lvl>
+    <w:lvl w:ilvl="7" w:tplc="04070003" w:tentative="1">
+      <w:start w:val="1"/>
+      <w:numFmt w:val="bullet"/>
+      <w:lvlText w:val="o"/>
+      <w:lvlJc w:val="left"/>
+      <w:pPr>
+        <w:ind w:left="5760" w:hanging="360"/>
+      </w:pPr>
+      <w:rPr>
+        <w:rFonts w:ascii="Courier New" w:hAnsi="Courier New" w:cs="Courier New" w:hint="default"/>
+      </w:rPr>
+    </w:lvl>
+    <w:lvl w:ilvl="8" w:tplc="04070005" w:tentative="1">
+      <w:start w:val="1"/>
+      <w:numFmt w:val="bullet"/>
+      <w:lvlText w:val=""/>
+      <w:lvlJc w:val="left"/>
+      <w:pPr>
+        <w:ind w:left="6480" w:hanging="360"/>
+      </w:pPr>
+      <w:rPr>
+        <w:rFonts w:ascii="Wingdings" w:hAnsi="Wingdings" w:hint="default"/>
+      </w:rPr>
+    </w:lvl>
+  </w:abstractNum>
+  <w:abstractNum w:abstractNumId="11" w15:restartNumberingAfterBreak="0">
     <w:nsid w:val="5374542A"/>
     <w:multiLevelType w:val="hybridMultilevel"/>
     <w:tmpl w:val="761A4CE2"/>
@@ -5253,7 +6856,7 @@
       </w:pPr>
     </w:lvl>
   </w:abstractNum>
-  <w:abstractNum w:abstractNumId="11" w15:restartNumberingAfterBreak="0">
+  <w:abstractNum w:abstractNumId="12" w15:restartNumberingAfterBreak="0">
     <w:nsid w:val="58F15D69"/>
     <w:multiLevelType w:val="hybridMultilevel"/>
     <w:tmpl w:val="3AA417FA"/>
@@ -5342,7 +6945,7 @@
       </w:pPr>
     </w:lvl>
   </w:abstractNum>
-  <w:abstractNum w:abstractNumId="12" w15:restartNumberingAfterBreak="0">
+  <w:abstractNum w:abstractNumId="13" w15:restartNumberingAfterBreak="0">
     <w:nsid w:val="5EBD4A37"/>
     <w:multiLevelType w:val="hybridMultilevel"/>
     <w:tmpl w:val="DAC66CFE"/>
@@ -5355,7 +6958,7 @@
         <w:ind w:left="720" w:hanging="360"/>
       </w:pPr>
       <w:rPr>
-        <w:rFonts w:hint="default" w:ascii="Symbol" w:hAnsi="Symbol"/>
+        <w:rFonts w:ascii="Symbol" w:hAnsi="Symbol" w:hint="default"/>
       </w:rPr>
     </w:lvl>
     <w:lvl w:ilvl="1" w:tplc="04070003" w:tentative="1">
@@ -5367,7 +6970,7 @@
         <w:ind w:left="1440" w:hanging="360"/>
       </w:pPr>
       <w:rPr>
-        <w:rFonts w:hint="default" w:ascii="Courier New" w:hAnsi="Courier New" w:cs="Courier New"/>
+        <w:rFonts w:ascii="Courier New" w:hAnsi="Courier New" w:cs="Courier New" w:hint="default"/>
       </w:rPr>
     </w:lvl>
     <w:lvl w:ilvl="2" w:tplc="04070005" w:tentative="1">
@@ -5379,7 +6982,7 @@
         <w:ind w:left="2160" w:hanging="360"/>
       </w:pPr>
       <w:rPr>
-        <w:rFonts w:hint="default" w:ascii="Wingdings" w:hAnsi="Wingdings"/>
+        <w:rFonts w:ascii="Wingdings" w:hAnsi="Wingdings" w:hint="default"/>
       </w:rPr>
     </w:lvl>
     <w:lvl w:ilvl="3" w:tplc="04070001" w:tentative="1">
@@ -5391,7 +6994,7 @@
         <w:ind w:left="2880" w:hanging="360"/>
       </w:pPr>
       <w:rPr>
-        <w:rFonts w:hint="default" w:ascii="Symbol" w:hAnsi="Symbol"/>
+        <w:rFonts w:ascii="Symbol" w:hAnsi="Symbol" w:hint="default"/>
       </w:rPr>
     </w:lvl>
     <w:lvl w:ilvl="4" w:tplc="04070003" w:tentative="1">
@@ -5403,7 +7006,7 @@
         <w:ind w:left="3600" w:hanging="360"/>
       </w:pPr>
       <w:rPr>
-        <w:rFonts w:hint="default" w:ascii="Courier New" w:hAnsi="Courier New" w:cs="Courier New"/>
+        <w:rFonts w:ascii="Courier New" w:hAnsi="Courier New" w:cs="Courier New" w:hint="default"/>
       </w:rPr>
     </w:lvl>
     <w:lvl w:ilvl="5" w:tplc="04070005" w:tentative="1">
@@ -5415,7 +7018,7 @@
         <w:ind w:left="4320" w:hanging="360"/>
       </w:pPr>
       <w:rPr>
-        <w:rFonts w:hint="default" w:ascii="Wingdings" w:hAnsi="Wingdings"/>
+        <w:rFonts w:ascii="Wingdings" w:hAnsi="Wingdings" w:hint="default"/>
       </w:rPr>
     </w:lvl>
     <w:lvl w:ilvl="6" w:tplc="04070001" w:tentative="1">
@@ -5427,7 +7030,7 @@
         <w:ind w:left="5040" w:hanging="360"/>
       </w:pPr>
       <w:rPr>
-        <w:rFonts w:hint="default" w:ascii="Symbol" w:hAnsi="Symbol"/>
+        <w:rFonts w:ascii="Symbol" w:hAnsi="Symbol" w:hint="default"/>
       </w:rPr>
     </w:lvl>
     <w:lvl w:ilvl="7" w:tplc="04070003" w:tentative="1">
@@ -5439,7 +7042,7 @@
         <w:ind w:left="5760" w:hanging="360"/>
       </w:pPr>
       <w:rPr>
-        <w:rFonts w:hint="default" w:ascii="Courier New" w:hAnsi="Courier New" w:cs="Courier New"/>
+        <w:rFonts w:ascii="Courier New" w:hAnsi="Courier New" w:cs="Courier New" w:hint="default"/>
       </w:rPr>
     </w:lvl>
     <w:lvl w:ilvl="8" w:tplc="04070005" w:tentative="1">
@@ -5451,11 +7054,11 @@
         <w:ind w:left="6480" w:hanging="360"/>
       </w:pPr>
       <w:rPr>
-        <w:rFonts w:hint="default" w:ascii="Wingdings" w:hAnsi="Wingdings"/>
+        <w:rFonts w:ascii="Wingdings" w:hAnsi="Wingdings" w:hint="default"/>
       </w:rPr>
     </w:lvl>
   </w:abstractNum>
-  <w:abstractNum w:abstractNumId="13" w15:restartNumberingAfterBreak="0">
+  <w:abstractNum w:abstractNumId="14" w15:restartNumberingAfterBreak="0">
     <w:nsid w:val="5EE95FD6"/>
     <w:multiLevelType w:val="hybridMultilevel"/>
     <w:tmpl w:val="82EC1B48"/>
@@ -5544,7 +7147,7 @@
       </w:pPr>
     </w:lvl>
   </w:abstractNum>
-  <w:abstractNum w:abstractNumId="14" w15:restartNumberingAfterBreak="0">
+  <w:abstractNum w:abstractNumId="15" w15:restartNumberingAfterBreak="0">
     <w:nsid w:val="728E79DA"/>
     <w:multiLevelType w:val="hybridMultilevel"/>
     <w:tmpl w:val="2AAA1694"/>
@@ -5641,7 +7244,7 @@
     <w:abstractNumId w:val="7"/>
   </w:num>
   <w:num w:numId="3">
-    <w:abstractNumId w:val="12"/>
+    <w:abstractNumId w:val="13"/>
   </w:num>
   <w:num w:numId="4">
     <w:abstractNumId w:val="1"/>
@@ -5653,7 +7256,7 @@
     <w:abstractNumId w:val="3"/>
   </w:num>
   <w:num w:numId="7">
-    <w:abstractNumId w:val="11"/>
+    <w:abstractNumId w:val="12"/>
   </w:num>
   <w:num w:numId="8">
     <w:abstractNumId w:val="8"/>
@@ -5662,10 +7265,10 @@
     <w:abstractNumId w:val="5"/>
   </w:num>
   <w:num w:numId="10">
-    <w:abstractNumId w:val="14"/>
+    <w:abstractNumId w:val="15"/>
   </w:num>
   <w:num w:numId="11">
-    <w:abstractNumId w:val="10"/>
+    <w:abstractNumId w:val="11"/>
   </w:num>
   <w:num w:numId="12">
     <w:abstractNumId w:val="9"/>
@@ -5677,17 +7280,20 @@
     <w:abstractNumId w:val="0"/>
   </w:num>
   <w:num w:numId="15">
-    <w:abstractNumId w:val="13"/>
+    <w:abstractNumId w:val="14"/>
+  </w:num>
+  <w:num w:numId="16">
+    <w:abstractNumId w:val="10"/>
   </w:num>
 </w:numbering>
 </file>
 
 <file path=word/styles.xml><?xml version="1.0" encoding="utf-8"?>
-<w:styles xmlns:wp14="http://schemas.microsoft.com/office/word/2010/wordprocessingDrawing" xmlns:mc="http://schemas.openxmlformats.org/markup-compatibility/2006" xmlns:r="http://schemas.openxmlformats.org/officeDocument/2006/relationships" xmlns:w="http://schemas.openxmlformats.org/wordprocessingml/2006/main" xmlns:w14="http://schemas.microsoft.com/office/word/2010/wordml" xmlns:w15="http://schemas.microsoft.com/office/word/2012/wordml" xmlns:w16cid="http://schemas.microsoft.com/office/word/2016/wordml/cid" xmlns:w16se="http://schemas.microsoft.com/office/word/2015/wordml/symex" mc:Ignorable="w14 w15 w16se w16cid wp14">
+<w:styles xmlns:mc="http://schemas.openxmlformats.org/markup-compatibility/2006" xmlns:r="http://schemas.openxmlformats.org/officeDocument/2006/relationships" xmlns:w="http://schemas.openxmlformats.org/wordprocessingml/2006/main" xmlns:w14="http://schemas.microsoft.com/office/word/2010/wordml" xmlns:w15="http://schemas.microsoft.com/office/word/2012/wordml" xmlns:w16cex="http://schemas.microsoft.com/office/word/2018/wordml/cex" xmlns:w16cid="http://schemas.microsoft.com/office/word/2016/wordml/cid" xmlns:w16="http://schemas.microsoft.com/office/word/2018/wordml" xmlns:w16sdtdh="http://schemas.microsoft.com/office/word/2020/wordml/sdtdatahash" xmlns:w16se="http://schemas.microsoft.com/office/word/2015/wordml/symex" mc:Ignorable="w14 w15 w16se w16cid w16 w16cex w16sdtdh">
   <w:docDefaults>
     <w:rPrDefault>
       <w:rPr>
-        <w:rFonts w:asciiTheme="minorHAnsi" w:hAnsiTheme="minorHAnsi" w:eastAsiaTheme="minorHAnsi" w:cstheme="minorBidi"/>
+        <w:rFonts w:asciiTheme="minorHAnsi" w:eastAsiaTheme="minorHAnsi" w:hAnsiTheme="minorHAnsi" w:cstheme="minorBidi"/>
         <w:sz w:val="22"/>
         <w:szCs w:val="22"/>
         <w:lang w:val="de-DE" w:eastAsia="en-US" w:bidi="ar-SA"/>
@@ -5699,17 +7305,17 @@
       </w:pPr>
     </w:pPrDefault>
   </w:docDefaults>
-  <w:latentStyles w:defLockedState="0" w:defUIPriority="99" w:defSemiHidden="0" w:defUnhideWhenUsed="0" w:defQFormat="0" w:count="375">
+  <w:latentStyles w:defLockedState="0" w:defUIPriority="99" w:defSemiHidden="0" w:defUnhideWhenUsed="0" w:defQFormat="0" w:count="376">
     <w:lsdException w:name="Normal" w:uiPriority="0" w:qFormat="1"/>
     <w:lsdException w:name="heading 1" w:uiPriority="9" w:qFormat="1"/>
-    <w:lsdException w:name="heading 2" w:uiPriority="9" w:semiHidden="1" w:unhideWhenUsed="1" w:qFormat="1"/>
-    <w:lsdException w:name="heading 3" w:uiPriority="9" w:semiHidden="1" w:unhideWhenUsed="1" w:qFormat="1"/>
-    <w:lsdException w:name="heading 4" w:uiPriority="9" w:semiHidden="1" w:unhideWhenUsed="1" w:qFormat="1"/>
-    <w:lsdException w:name="heading 5" w:uiPriority="9" w:semiHidden="1" w:unhideWhenUsed="1" w:qFormat="1"/>
-    <w:lsdException w:name="heading 6" w:uiPriority="9" w:semiHidden="1" w:unhideWhenUsed="1" w:qFormat="1"/>
-    <w:lsdException w:name="heading 7" w:uiPriority="9" w:semiHidden="1" w:unhideWhenUsed="1" w:qFormat="1"/>
-    <w:lsdException w:name="heading 8" w:uiPriority="9" w:semiHidden="1" w:unhideWhenUsed="1" w:qFormat="1"/>
-    <w:lsdException w:name="heading 9" w:uiPriority="9" w:semiHidden="1" w:unhideWhenUsed="1" w:qFormat="1"/>
+    <w:lsdException w:name="heading 2" w:semiHidden="1" w:uiPriority="9" w:unhideWhenUsed="1" w:qFormat="1"/>
+    <w:lsdException w:name="heading 3" w:semiHidden="1" w:uiPriority="9" w:unhideWhenUsed="1" w:qFormat="1"/>
+    <w:lsdException w:name="heading 4" w:semiHidden="1" w:uiPriority="9" w:unhideWhenUsed="1" w:qFormat="1"/>
+    <w:lsdException w:name="heading 5" w:semiHidden="1" w:uiPriority="9" w:unhideWhenUsed="1" w:qFormat="1"/>
+    <w:lsdException w:name="heading 6" w:semiHidden="1" w:uiPriority="9" w:unhideWhenUsed="1" w:qFormat="1"/>
+    <w:lsdException w:name="heading 7" w:semiHidden="1" w:uiPriority="9" w:unhideWhenUsed="1" w:qFormat="1"/>
+    <w:lsdException w:name="heading 8" w:semiHidden="1" w:uiPriority="9" w:unhideWhenUsed="1" w:qFormat="1"/>
+    <w:lsdException w:name="heading 9" w:semiHidden="1" w:uiPriority="9" w:unhideWhenUsed="1" w:qFormat="1"/>
     <w:lsdException w:name="index 1" w:semiHidden="1" w:unhideWhenUsed="1"/>
     <w:lsdException w:name="index 2" w:semiHidden="1" w:unhideWhenUsed="1"/>
     <w:lsdException w:name="index 3" w:semiHidden="1" w:unhideWhenUsed="1"/>
@@ -5719,22 +7325,22 @@
     <w:lsdException w:name="index 7" w:semiHidden="1" w:unhideWhenUsed="1"/>
     <w:lsdException w:name="index 8" w:semiHidden="1" w:unhideWhenUsed="1"/>
     <w:lsdException w:name="index 9" w:semiHidden="1" w:unhideWhenUsed="1"/>
-    <w:lsdException w:name="toc 1" w:uiPriority="39" w:semiHidden="1" w:unhideWhenUsed="1"/>
-    <w:lsdException w:name="toc 2" w:uiPriority="39" w:semiHidden="1" w:unhideWhenUsed="1"/>
-    <w:lsdException w:name="toc 3" w:uiPriority="39" w:semiHidden="1" w:unhideWhenUsed="1"/>
-    <w:lsdException w:name="toc 4" w:uiPriority="39" w:semiHidden="1" w:unhideWhenUsed="1"/>
-    <w:lsdException w:name="toc 5" w:uiPriority="39" w:semiHidden="1" w:unhideWhenUsed="1"/>
-    <w:lsdException w:name="toc 6" w:uiPriority="39" w:semiHidden="1" w:unhideWhenUsed="1"/>
-    <w:lsdException w:name="toc 7" w:uiPriority="39" w:semiHidden="1" w:unhideWhenUsed="1"/>
-    <w:lsdException w:name="toc 8" w:uiPriority="39" w:semiHidden="1" w:unhideWhenUsed="1"/>
-    <w:lsdException w:name="toc 9" w:uiPriority="39" w:semiHidden="1" w:unhideWhenUsed="1"/>
+    <w:lsdException w:name="toc 1" w:semiHidden="1" w:uiPriority="39" w:unhideWhenUsed="1"/>
+    <w:lsdException w:name="toc 2" w:semiHidden="1" w:uiPriority="39" w:unhideWhenUsed="1"/>
+    <w:lsdException w:name="toc 3" w:semiHidden="1" w:uiPriority="39" w:unhideWhenUsed="1"/>
+    <w:lsdException w:name="toc 4" w:semiHidden="1" w:uiPriority="39" w:unhideWhenUsed="1"/>
+    <w:lsdException w:name="toc 5" w:semiHidden="1" w:uiPriority="39" w:unhideWhenUsed="1"/>
+    <w:lsdException w:name="toc 6" w:semiHidden="1" w:uiPriority="39" w:unhideWhenUsed="1"/>
+    <w:lsdException w:name="toc 7" w:semiHidden="1" w:uiPriority="39" w:unhideWhenUsed="1"/>
+    <w:lsdException w:name="toc 8" w:semiHidden="1" w:uiPriority="39" w:unhideWhenUsed="1"/>
+    <w:lsdException w:name="toc 9" w:semiHidden="1" w:uiPriority="39" w:unhideWhenUsed="1"/>
     <w:lsdException w:name="Normal Indent" w:semiHidden="1" w:unhideWhenUsed="1"/>
     <w:lsdException w:name="footnote text" w:semiHidden="1" w:unhideWhenUsed="1"/>
     <w:lsdException w:name="annotation text" w:semiHidden="1" w:unhideWhenUsed="1"/>
-    <w:lsdException w:name="header" w:uiPriority="0" w:semiHidden="1" w:unhideWhenUsed="1"/>
+    <w:lsdException w:name="header" w:semiHidden="1" w:uiPriority="0" w:unhideWhenUsed="1"/>
     <w:lsdException w:name="footer" w:semiHidden="1" w:unhideWhenUsed="1"/>
     <w:lsdException w:name="index heading" w:semiHidden="1" w:unhideWhenUsed="1"/>
-    <w:lsdException w:name="caption" w:uiPriority="35" w:semiHidden="1" w:unhideWhenUsed="1" w:qFormat="1"/>
+    <w:lsdException w:name="caption" w:semiHidden="1" w:uiPriority="35" w:unhideWhenUsed="1" w:qFormat="1"/>
     <w:lsdException w:name="table of figures" w:semiHidden="1" w:unhideWhenUsed="1"/>
     <w:lsdException w:name="envelope address" w:semiHidden="1" w:unhideWhenUsed="1"/>
     <w:lsdException w:name="envelope return" w:semiHidden="1" w:unhideWhenUsed="1"/>
@@ -5765,7 +7371,7 @@
     <w:lsdException w:name="Title" w:uiPriority="10" w:qFormat="1"/>
     <w:lsdException w:name="Closing" w:semiHidden="1" w:unhideWhenUsed="1"/>
     <w:lsdException w:name="Signature" w:semiHidden="1" w:unhideWhenUsed="1"/>
-    <w:lsdException w:name="Default Paragraph Font" w:uiPriority="1" w:semiHidden="1" w:unhideWhenUsed="1"/>
+    <w:lsdException w:name="Default Paragraph Font" w:semiHidden="1" w:uiPriority="1" w:unhideWhenUsed="1"/>
     <w:lsdException w:name="Body Text" w:semiHidden="1" w:unhideWhenUsed="1"/>
     <w:lsdException w:name="Body Text Indent" w:semiHidden="1" w:unhideWhenUsed="1"/>
     <w:lsdException w:name="List Continue" w:semiHidden="1" w:unhideWhenUsed="1"/>
@@ -5805,7 +7411,6 @@
     <w:lsdException w:name="HTML Sample" w:semiHidden="1" w:unhideWhenUsed="1"/>
     <w:lsdException w:name="HTML Typewriter" w:semiHidden="1" w:unhideWhenUsed="1"/>
     <w:lsdException w:name="HTML Variable" w:semiHidden="1" w:unhideWhenUsed="1"/>
-    <w:lsdException w:name="Normal Table" w:semiHidden="1" w:unhideWhenUsed="1"/>
     <w:lsdException w:name="annotation subject" w:semiHidden="1" w:unhideWhenUsed="1"/>
     <w:lsdException w:name="No List" w:semiHidden="1" w:unhideWhenUsed="1"/>
     <w:lsdException w:name="Outline List 1" w:semiHidden="1" w:unhideWhenUsed="1"/>
@@ -5852,10 +7457,8 @@
     <w:lsdException w:name="Table Subtle 2" w:semiHidden="1" w:unhideWhenUsed="1"/>
     <w:lsdException w:name="Table Web 1" w:semiHidden="1" w:unhideWhenUsed="1"/>
     <w:lsdException w:name="Table Web 2" w:semiHidden="1" w:unhideWhenUsed="1"/>
-    <w:lsdException w:name="Table Web 3" w:semiHidden="1" w:unhideWhenUsed="1"/>
     <w:lsdException w:name="Balloon Text" w:semiHidden="1" w:unhideWhenUsed="1"/>
     <w:lsdException w:name="Table Grid" w:uiPriority="39"/>
-    <w:lsdException w:name="Table Theme" w:semiHidden="1" w:unhideWhenUsed="1"/>
     <w:lsdException w:name="Placeholder Text" w:semiHidden="1"/>
     <w:lsdException w:name="No Spacing" w:uiPriority="1" w:qFormat="1"/>
     <w:lsdException w:name="Light Shading" w:uiPriority="60"/>
@@ -5965,8 +7568,8 @@
     <w:lsdException w:name="Subtle Reference" w:uiPriority="31" w:qFormat="1"/>
     <w:lsdException w:name="Intense Reference" w:uiPriority="32" w:qFormat="1"/>
     <w:lsdException w:name="Book Title" w:uiPriority="33" w:qFormat="1"/>
-    <w:lsdException w:name="Bibliography" w:uiPriority="37" w:semiHidden="1" w:unhideWhenUsed="1"/>
-    <w:lsdException w:name="TOC Heading" w:uiPriority="39" w:semiHidden="1" w:unhideWhenUsed="1" w:qFormat="1"/>
+    <w:lsdException w:name="Bibliography" w:semiHidden="1" w:uiPriority="37" w:unhideWhenUsed="1"/>
+    <w:lsdException w:name="TOC Heading" w:semiHidden="1" w:uiPriority="39" w:unhideWhenUsed="1" w:qFormat="1"/>
     <w:lsdException w:name="Plain Table 1" w:uiPriority="41"/>
     <w:lsdException w:name="Plain Table 2" w:uiPriority="42"/>
     <w:lsdException w:name="Plain Table 3" w:uiPriority="43"/>
@@ -6075,18 +7678,19 @@
     <w:lsdException w:name="Smart Hyperlink" w:semiHidden="1" w:unhideWhenUsed="1"/>
     <w:lsdException w:name="Hashtag" w:semiHidden="1" w:unhideWhenUsed="1"/>
     <w:lsdException w:name="Unresolved Mention" w:semiHidden="1" w:unhideWhenUsed="1"/>
+    <w:lsdException w:name="Smart Link" w:semiHidden="1" w:unhideWhenUsed="1"/>
   </w:latentStyles>
-  <w:style w:type="paragraph" w:styleId="Standard" w:default="1">
+  <w:style w:type="paragraph" w:default="1" w:styleId="Normal">
     <w:name w:val="Normal"/>
     <w:qFormat/>
   </w:style>
-  <w:style w:type="character" w:styleId="Absatz-Standardschriftart" w:default="1">
+  <w:style w:type="character" w:default="1" w:styleId="DefaultParagraphFont">
     <w:name w:val="Default Paragraph Font"/>
     <w:uiPriority w:val="1"/>
     <w:semiHidden/>
     <w:unhideWhenUsed/>
   </w:style>
-  <w:style w:type="table" w:styleId="NormaleTabelle" w:default="1">
+  <w:style w:type="table" w:default="1" w:styleId="TableNormal">
     <w:name w:val="Normal Table"/>
     <w:uiPriority w:val="99"/>
     <w:semiHidden/>
@@ -6101,7 +7705,7 @@
       </w:tblCellMar>
     </w:tblPr>
   </w:style>
-  <w:style w:type="numbering" w:styleId="KeineListe" w:default="1">
+  <w:style w:type="numbering" w:default="1" w:styleId="NoList">
     <w:name w:val="No List"/>
     <w:uiPriority w:val="99"/>
     <w:semiHidden/>
@@ -6109,7 +7713,7 @@
   </w:style>
   <w:style w:type="character" w:styleId="Hyperlink">
     <w:name w:val="Hyperlink"/>
-    <w:basedOn w:val="Absatz-Standardschriftart"/>
+    <w:basedOn w:val="DefaultParagraphFont"/>
     <w:uiPriority w:val="99"/>
     <w:semiHidden/>
     <w:unhideWhenUsed/>
@@ -6119,9 +7723,9 @@
       <w:u w:val="single"/>
     </w:rPr>
   </w:style>
-  <w:style w:type="table" w:styleId="Tabellenraster">
+  <w:style w:type="table" w:styleId="TableGrid">
     <w:name w:val="Table Grid"/>
-    <w:basedOn w:val="NormaleTabelle"/>
+    <w:basedOn w:val="TableNormal"/>
     <w:uiPriority w:val="39"/>
     <w:rsid w:val="000B5621"/>
     <w:pPr>
@@ -6129,19 +7733,19 @@
     </w:pPr>
     <w:tblPr>
       <w:tblBorders>
-        <w:top w:val="single" w:color="auto" w:sz="4" w:space="0"/>
-        <w:left w:val="single" w:color="auto" w:sz="4" w:space="0"/>
-        <w:bottom w:val="single" w:color="auto" w:sz="4" w:space="0"/>
-        <w:right w:val="single" w:color="auto" w:sz="4" w:space="0"/>
-        <w:insideH w:val="single" w:color="auto" w:sz="4" w:space="0"/>
-        <w:insideV w:val="single" w:color="auto" w:sz="4" w:space="0"/>
+        <w:top w:val="single" w:sz="4" w:space="0" w:color="auto"/>
+        <w:left w:val="single" w:sz="4" w:space="0" w:color="auto"/>
+        <w:bottom w:val="single" w:sz="4" w:space="0" w:color="auto"/>
+        <w:right w:val="single" w:sz="4" w:space="0" w:color="auto"/>
+        <w:insideH w:val="single" w:sz="4" w:space="0" w:color="auto"/>
+        <w:insideV w:val="single" w:sz="4" w:space="0" w:color="auto"/>
       </w:tblBorders>
     </w:tblPr>
   </w:style>
-  <w:style w:type="paragraph" w:styleId="Kopfzeile">
+  <w:style w:type="paragraph" w:styleId="Header">
     <w:name w:val="header"/>
-    <w:basedOn w:val="Standard"/>
-    <w:link w:val="KopfzeileZchn"/>
+    <w:basedOn w:val="Normal"/>
+    <w:link w:val="HeaderChar"/>
     <w:unhideWhenUsed/>
     <w:rsid w:val="00540EB4"/>
     <w:pPr>
@@ -6152,16 +7756,16 @@
       <w:spacing w:after="0" w:line="240" w:lineRule="auto"/>
     </w:pPr>
   </w:style>
-  <w:style w:type="character" w:styleId="KopfzeileZchn" w:customStyle="1">
-    <w:name w:val="Kopfzeile Zchn"/>
-    <w:basedOn w:val="Absatz-Standardschriftart"/>
-    <w:link w:val="Kopfzeile"/>
+  <w:style w:type="character" w:customStyle="1" w:styleId="HeaderChar">
+    <w:name w:val="Header Char"/>
+    <w:basedOn w:val="DefaultParagraphFont"/>
+    <w:link w:val="Header"/>
     <w:rsid w:val="00540EB4"/>
   </w:style>
-  <w:style w:type="paragraph" w:styleId="Fuzeile">
+  <w:style w:type="paragraph" w:styleId="Footer">
     <w:name w:val="footer"/>
-    <w:basedOn w:val="Standard"/>
-    <w:link w:val="FuzeileZchn"/>
+    <w:basedOn w:val="Normal"/>
+    <w:link w:val="FooterChar"/>
     <w:uiPriority w:val="99"/>
     <w:unhideWhenUsed/>
     <w:rsid w:val="00540EB4"/>
@@ -6173,16 +7777,16 @@
       <w:spacing w:after="0" w:line="240" w:lineRule="auto"/>
     </w:pPr>
   </w:style>
-  <w:style w:type="character" w:styleId="FuzeileZchn" w:customStyle="1">
-    <w:name w:val="Fußzeile Zchn"/>
-    <w:basedOn w:val="Absatz-Standardschriftart"/>
-    <w:link w:val="Fuzeile"/>
+  <w:style w:type="character" w:customStyle="1" w:styleId="FooterChar">
+    <w:name w:val="Footer Char"/>
+    <w:basedOn w:val="DefaultParagraphFont"/>
+    <w:link w:val="Footer"/>
     <w:uiPriority w:val="99"/>
     <w:rsid w:val="00540EB4"/>
   </w:style>
-  <w:style w:type="paragraph" w:styleId="Listenabsatz">
+  <w:style w:type="paragraph" w:styleId="ListParagraph">
     <w:name w:val="List Paragraph"/>
-    <w:basedOn w:val="Standard"/>
+    <w:basedOn w:val="Normal"/>
     <w:uiPriority w:val="34"/>
     <w:qFormat/>
     <w:rsid w:val="00A018E6"/>
@@ -6191,10 +7795,10 @@
       <w:contextualSpacing/>
     </w:pPr>
   </w:style>
-  <w:style w:type="table" w:styleId="Tabellenraster1" w:customStyle="1">
+  <w:style w:type="table" w:customStyle="1" w:styleId="Tabellenraster1">
     <w:name w:val="Tabellenraster1"/>
-    <w:basedOn w:val="NormaleTabelle"/>
-    <w:next w:val="Tabellenraster"/>
+    <w:basedOn w:val="TableNormal"/>
+    <w:next w:val="TableGrid"/>
     <w:uiPriority w:val="39"/>
     <w:rsid w:val="00EC17A8"/>
     <w:pPr>
@@ -6202,19 +7806,19 @@
     </w:pPr>
     <w:tblPr>
       <w:tblBorders>
-        <w:top w:val="single" w:color="auto" w:sz="4" w:space="0"/>
-        <w:left w:val="single" w:color="auto" w:sz="4" w:space="0"/>
-        <w:bottom w:val="single" w:color="auto" w:sz="4" w:space="0"/>
-        <w:right w:val="single" w:color="auto" w:sz="4" w:space="0"/>
-        <w:insideH w:val="single" w:color="auto" w:sz="4" w:space="0"/>
-        <w:insideV w:val="single" w:color="auto" w:sz="4" w:space="0"/>
+        <w:top w:val="single" w:sz="4" w:space="0" w:color="auto"/>
+        <w:left w:val="single" w:sz="4" w:space="0" w:color="auto"/>
+        <w:bottom w:val="single" w:sz="4" w:space="0" w:color="auto"/>
+        <w:right w:val="single" w:sz="4" w:space="0" w:color="auto"/>
+        <w:insideH w:val="single" w:sz="4" w:space="0" w:color="auto"/>
+        <w:insideV w:val="single" w:sz="4" w:space="0" w:color="auto"/>
       </w:tblBorders>
     </w:tblPr>
   </w:style>
-  <w:style w:type="table" w:styleId="Tabellenraster2" w:customStyle="1">
+  <w:style w:type="table" w:customStyle="1" w:styleId="Tabellenraster2">
     <w:name w:val="Tabellenraster2"/>
-    <w:basedOn w:val="NormaleTabelle"/>
-    <w:next w:val="Tabellenraster"/>
+    <w:basedOn w:val="TableNormal"/>
+    <w:next w:val="TableGrid"/>
     <w:uiPriority w:val="39"/>
     <w:rsid w:val="00384109"/>
     <w:pPr>
@@ -6222,12 +7826,12 @@
     </w:pPr>
     <w:tblPr>
       <w:tblBorders>
-        <w:top w:val="single" w:color="auto" w:sz="4" w:space="0"/>
-        <w:left w:val="single" w:color="auto" w:sz="4" w:space="0"/>
-        <w:bottom w:val="single" w:color="auto" w:sz="4" w:space="0"/>
-        <w:right w:val="single" w:color="auto" w:sz="4" w:space="0"/>
-        <w:insideH w:val="single" w:color="auto" w:sz="4" w:space="0"/>
-        <w:insideV w:val="single" w:color="auto" w:sz="4" w:space="0"/>
+        <w:top w:val="single" w:sz="4" w:space="0" w:color="auto"/>
+        <w:left w:val="single" w:sz="4" w:space="0" w:color="auto"/>
+        <w:bottom w:val="single" w:sz="4" w:space="0" w:color="auto"/>
+        <w:right w:val="single" w:sz="4" w:space="0" w:color="auto"/>
+        <w:insideH w:val="single" w:sz="4" w:space="0" w:color="auto"/>
+        <w:insideV w:val="single" w:sz="4" w:space="0" w:color="auto"/>
       </w:tblBorders>
     </w:tblPr>
   </w:style>
@@ -10797,21 +12401,6 @@
 </file>
 
 <file path=customXml/item1.xml><?xml version="1.0" encoding="utf-8"?>
-<?mso-contentType ?>
-<FormTemplates xmlns="http://schemas.microsoft.com/sharepoint/v3/contenttype/forms">
-  <Display>DocumentLibraryForm</Display>
-  <Edit>DocumentLibraryForm</Edit>
-  <New>DocumentLibraryForm</New>
-</FormTemplates>
-</file>
-
-<file path=customXml/item2.xml><?xml version="1.0" encoding="utf-8"?>
-<p:properties xmlns:p="http://schemas.microsoft.com/office/2006/metadata/properties" xmlns:xsi="http://www.w3.org/2001/XMLSchema-instance" xmlns:pc="http://schemas.microsoft.com/office/infopath/2007/PartnerControls">
-  <documentManagement/>
-</p:properties>
-</file>
-
-<file path=customXml/item3.xml><?xml version="1.0" encoding="utf-8"?>
 <ct:contentTypeSchema xmlns:ct="http://schemas.microsoft.com/office/2006/metadata/contentType" xmlns:ma="http://schemas.microsoft.com/office/2006/metadata/properties/metaAttributes" ct:_="" ma:_="" ma:contentTypeName="Dokument" ma:contentTypeID="0x0101007A9E6D63A99F9C43A02979B121C777EA" ma:contentTypeVersion="9" ma:contentTypeDescription="Ein neues Dokument erstellen." ma:contentTypeScope="" ma:versionID="559513ee8bac2a2c2fb9a0a0498da594">
   <xsd:schema xmlns:xsd="http://www.w3.org/2001/XMLSchema" xmlns:xs="http://www.w3.org/2001/XMLSchema" xmlns:p="http://schemas.microsoft.com/office/2006/metadata/properties" xmlns:ns2="fc235c0e-72f3-44b5-b0da-fefce04bdbba" targetNamespace="http://schemas.microsoft.com/office/2006/metadata/properties" ma:root="true" ma:fieldsID="db6ec7e3bab63dde665d6656f7ba9e6a" ns2:_="">
     <xsd:import namespace="fc235c0e-72f3-44b5-b0da-fefce04bdbba"/>
@@ -10989,10 +12578,35 @@
 </ct:contentTypeSchema>
 </file>
 
+<file path=customXml/item2.xml><?xml version="1.0" encoding="utf-8"?>
+<p:properties xmlns:p="http://schemas.microsoft.com/office/2006/metadata/properties" xmlns:xsi="http://www.w3.org/2001/XMLSchema-instance" xmlns:pc="http://schemas.microsoft.com/office/infopath/2007/PartnerControls">
+  <documentManagement/>
+</p:properties>
+</file>
+
+<file path=customXml/item3.xml><?xml version="1.0" encoding="utf-8"?>
+<?mso-contentType ?>
+<FormTemplates xmlns="http://schemas.microsoft.com/sharepoint/v3/contenttype/forms">
+  <Display>DocumentLibraryForm</Display>
+  <Edit>DocumentLibraryForm</Edit>
+  <New>DocumentLibraryForm</New>
+</FormTemplates>
+</file>
+
 <file path=customXml/itemProps1.xml><?xml version="1.0" encoding="utf-8"?>
-<ds:datastoreItem xmlns:ds="http://schemas.openxmlformats.org/officeDocument/2006/customXml" ds:itemID="{1AAAAA6F-BE38-4C09-B6D7-DB3B01AF0F40}">
+<ds:datastoreItem xmlns:ds="http://schemas.openxmlformats.org/officeDocument/2006/customXml" ds:itemID="{98D74EE8-F3E3-4DCD-A00C-E66C6CDC69E1}">
   <ds:schemaRefs>
-    <ds:schemaRef ds:uri="http://schemas.microsoft.com/sharepoint/v3/contenttype/forms"/>
+    <ds:schemaRef ds:uri="http://schemas.microsoft.com/office/2006/metadata/contentType"/>
+    <ds:schemaRef ds:uri="http://schemas.microsoft.com/office/2006/metadata/properties/metaAttributes"/>
+    <ds:schemaRef ds:uri="http://www.w3.org/2001/XMLSchema"/>
+    <ds:schemaRef ds:uri="http://schemas.microsoft.com/office/2006/metadata/properties"/>
+    <ds:schemaRef ds:uri="fc235c0e-72f3-44b5-b0da-fefce04bdbba"/>
+    <ds:schemaRef ds:uri="http://schemas.microsoft.com/office/2006/documentManagement/types"/>
+    <ds:schemaRef ds:uri="http://schemas.microsoft.com/office/infopath/2007/PartnerControls"/>
+    <ds:schemaRef ds:uri="http://schemas.openxmlformats.org/package/2006/metadata/core-properties"/>
+    <ds:schemaRef ds:uri="http://purl.org/dc/elements/1.1/"/>
+    <ds:schemaRef ds:uri="http://purl.org/dc/terms/"/>
+    <ds:schemaRef ds:uri="http://schemas.microsoft.com/internal/obd"/>
   </ds:schemaRefs>
 </ds:datastoreItem>
 </file>
@@ -11007,5 +12621,9 @@
 </file>
 
 <file path=customXml/itemProps3.xml><?xml version="1.0" encoding="utf-8"?>
-<ds:datastoreItem xmlns:ds="http://schemas.openxmlformats.org/officeDocument/2006/customXml" ds:itemID="{98D74EE8-F3E3-4DCD-A00C-E66C6CDC69E1}"/>
+<ds:datastoreItem xmlns:ds="http://schemas.openxmlformats.org/officeDocument/2006/customXml" ds:itemID="{1AAAAA6F-BE38-4C09-B6D7-DB3B01AF0F40}">
+  <ds:schemaRefs>
+    <ds:schemaRef ds:uri="http://schemas.microsoft.com/sharepoint/v3/contenttype/forms"/>
+  </ds:schemaRefs>
+</ds:datastoreItem>
 </file>
</xml_diff>